<commit_message>
Update PRD with system architecture and API contract
</commit_message>
<xml_diff>
--- a/docs/PROJECT REQUIREMENTS DOCUMENT(Expense_tracker).docx
+++ b/docs/PROJECT REQUIREMENTS DOCUMENT(Expense_tracker).docx
@@ -778,16 +778,7 @@
           <w:lang w:eastAsia="en-IN"/>
           <w14:ligatures w14:val="none"/>
         </w:rPr>
-        <w:t>Analyse</w:t>
-      </w:r>
-      <w:r>
-        <w:rPr>
-          <w:rFonts w:ascii="Times New Roman" w:eastAsia="Times New Roman" w:hAnsi="Times New Roman" w:cs="Times New Roman"/>
-          <w:kern w:val="0"/>
-          <w:lang w:eastAsia="en-IN"/>
-          <w14:ligatures w14:val="none"/>
-        </w:rPr>
-        <w:t xml:space="preserve"> spending data</w:t>
+        <w:t>Analyse spending data</w:t>
       </w:r>
     </w:p>
     <w:p>
@@ -1915,16 +1906,7 @@
           <w:lang w:eastAsia="en-IN"/>
           <w14:ligatures w14:val="none"/>
         </w:rPr>
-        <w:t>B</w:t>
-      </w:r>
-      <w:r>
-        <w:rPr>
-          <w:rFonts w:ascii="Times New Roman" w:eastAsia="Times New Roman" w:hAnsi="Times New Roman" w:cs="Times New Roman"/>
-          <w:kern w:val="0"/>
-          <w:lang w:eastAsia="en-IN"/>
-          <w14:ligatures w14:val="none"/>
-        </w:rPr>
-        <w:t>crypt</w:t>
+        <w:t>Bcrypt</w:t>
       </w:r>
       <w:proofErr w:type="spellEnd"/>
     </w:p>
@@ -2491,28 +2473,2822 @@
     </w:p>
     <w:p>
       <w:pPr>
-        <w:spacing w:after="0" w:line="240" w:lineRule="auto"/>
-        <w:rPr>
-          <w:rFonts w:ascii="Times New Roman" w:eastAsia="Times New Roman" w:hAnsi="Times New Roman" w:cs="Times New Roman"/>
+        <w:spacing w:before="100" w:beforeAutospacing="1" w:after="100" w:afterAutospacing="1" w:line="240" w:lineRule="auto"/>
+        <w:rPr>
+          <w:rFonts w:ascii="Times New Roman" w:eastAsia="Times New Roman" w:hAnsi="Times New Roman" w:cs="Times New Roman"/>
+          <w:kern w:val="0"/>
+          <w:lang w:eastAsia="en-IN"/>
+          <w14:ligatures w14:val="none"/>
+        </w:rPr>
+      </w:pPr>
+      <w:r>
+        <w:rPr>
+          <w:rFonts w:ascii="Times New Roman" w:eastAsia="Times New Roman" w:hAnsi="Times New Roman" w:cs="Times New Roman"/>
+          <w:b/>
+          <w:bCs/>
+          <w:kern w:val="0"/>
+          <w:sz w:val="27"/>
+          <w:szCs w:val="27"/>
+          <w:lang w:eastAsia="en-IN"/>
+          <w14:ligatures w14:val="none"/>
+        </w:rPr>
+        <w:t>11. System Architecture</w:t>
+      </w:r>
+    </w:p>
+    <w:p>
+      <w:pPr>
+        <w:pStyle w:val="ListParagraph"/>
+        <w:numPr>
+          <w:ilvl w:val="0"/>
+          <w:numId w:val="30"/>
+        </w:numPr>
+        <w:spacing w:before="100" w:beforeAutospacing="1" w:after="100" w:afterAutospacing="1" w:line="240" w:lineRule="auto"/>
+        <w:rPr>
+          <w:rFonts w:ascii="Times New Roman" w:eastAsia="Times New Roman" w:hAnsi="Times New Roman" w:cs="Times New Roman"/>
+          <w:kern w:val="0"/>
+          <w:lang w:eastAsia="en-IN"/>
+          <w14:ligatures w14:val="none"/>
+        </w:rPr>
+      </w:pPr>
+      <w:r>
+        <w:rPr>
+          <w:rFonts w:ascii="Times New Roman" w:eastAsia="Times New Roman" w:hAnsi="Times New Roman" w:cs="Times New Roman"/>
+          <w:kern w:val="0"/>
+          <w:lang w:eastAsia="en-IN"/>
+          <w14:ligatures w14:val="none"/>
+        </w:rPr>
+        <w:t>The Expense Tracker application follows a client-server architecture. The frontend is developed using React and is responsible for user interaction and UI rendering. The frontend communicates with the backend through RESTful APIs using HTTP requests.</w:t>
+      </w:r>
+    </w:p>
+    <w:p>
+      <w:pPr>
+        <w:pStyle w:val="ListParagraph"/>
+        <w:numPr>
+          <w:ilvl w:val="0"/>
+          <w:numId w:val="30"/>
+        </w:numPr>
+        <w:spacing w:before="100" w:beforeAutospacing="1" w:after="100" w:afterAutospacing="1" w:line="240" w:lineRule="auto"/>
+        <w:rPr>
+          <w:rFonts w:ascii="Times New Roman" w:eastAsia="Times New Roman" w:hAnsi="Times New Roman" w:cs="Times New Roman"/>
+          <w:kern w:val="0"/>
+          <w:lang w:eastAsia="en-IN"/>
+          <w14:ligatures w14:val="none"/>
+        </w:rPr>
+      </w:pPr>
+      <w:r>
+        <w:rPr>
+          <w:rFonts w:ascii="Times New Roman" w:eastAsia="Times New Roman" w:hAnsi="Times New Roman" w:cs="Times New Roman"/>
+          <w:kern w:val="0"/>
+          <w:lang w:eastAsia="en-IN"/>
+          <w14:ligatures w14:val="none"/>
+        </w:rPr>
+        <w:t xml:space="preserve">The backend is built using Node.js and Express.js, which handles business logic, authentication, request validation, and data processing. Expense data is stored in a MongoDB database for persistent storage. In future phases, the backend will integrate with an AI service to </w:t>
+      </w:r>
+      <w:proofErr w:type="spellStart"/>
+      <w:r>
+        <w:rPr>
+          <w:rFonts w:ascii="Times New Roman" w:eastAsia="Times New Roman" w:hAnsi="Times New Roman" w:cs="Times New Roman"/>
+          <w:kern w:val="0"/>
+          <w:lang w:eastAsia="en-IN"/>
+          <w14:ligatures w14:val="none"/>
+        </w:rPr>
+        <w:t>analyze</w:t>
+      </w:r>
+      <w:proofErr w:type="spellEnd"/>
+      <w:r>
+        <w:rPr>
+          <w:rFonts w:ascii="Times New Roman" w:eastAsia="Times New Roman" w:hAnsi="Times New Roman" w:cs="Times New Roman"/>
+          <w:kern w:val="0"/>
+          <w:lang w:eastAsia="en-IN"/>
+          <w14:ligatures w14:val="none"/>
+        </w:rPr>
+        <w:t xml:space="preserve"> user spending patterns and generate insights.</w:t>
+      </w:r>
+    </w:p>
+    <w:p>
+      <w:pPr>
+        <w:spacing w:before="100" w:beforeAutospacing="1" w:after="100" w:afterAutospacing="1" w:line="240" w:lineRule="auto"/>
+        <w:rPr>
+          <w:rFonts w:ascii="Times New Roman" w:eastAsia="Times New Roman" w:hAnsi="Times New Roman" w:cs="Times New Roman"/>
+          <w:b/>
+          <w:bCs/>
+          <w:kern w:val="0"/>
+          <w:lang w:eastAsia="en-IN"/>
+          <w14:ligatures w14:val="none"/>
+        </w:rPr>
+      </w:pPr>
+      <w:r>
+        <w:rPr>
+          <w:rFonts w:ascii="Courier New" w:eastAsia="Times New Roman" w:hAnsi="Courier New" w:cs="Courier New"/>
           <w:kern w:val="0"/>
           <w:sz w:val="20"/>
           <w:szCs w:val="20"/>
           <w:lang w:eastAsia="en-IN"/>
           <w14:ligatures w14:val="none"/>
         </w:rPr>
-      </w:pPr>
+        <w:drawing>
+          <wp:anchor distT="0" distB="0" distL="114300" distR="114300" simplePos="0" relativeHeight="251658240" behindDoc="0" locked="0" layoutInCell="1" allowOverlap="1" wp14:anchorId="1559B32D" wp14:editId="08321773">
+            <wp:simplePos x="0" y="0"/>
+            <wp:positionH relativeFrom="column">
+              <wp:posOffset>152157</wp:posOffset>
+            </wp:positionH>
+            <wp:positionV relativeFrom="paragraph">
+              <wp:posOffset>303238</wp:posOffset>
+            </wp:positionV>
+            <wp:extent cx="1613535" cy="1550670"/>
+            <wp:effectExtent l="19050" t="19050" r="24765" b="11430"/>
+            <wp:wrapNone/>
+            <wp:docPr id="1730020915" name="Picture 1"/>
+            <wp:cNvGraphicFramePr>
+              <a:graphicFrameLocks xmlns:a="http://schemas.openxmlformats.org/drawingml/2006/main" noChangeAspect="1"/>
+            </wp:cNvGraphicFramePr>
+            <a:graphic xmlns:a="http://schemas.openxmlformats.org/drawingml/2006/main">
+              <a:graphicData uri="http://schemas.openxmlformats.org/drawingml/2006/picture">
+                <pic:pic xmlns:pic="http://schemas.openxmlformats.org/drawingml/2006/picture">
+                  <pic:nvPicPr>
+                    <pic:cNvPr id="1730020915" name=""/>
+                    <pic:cNvPicPr/>
+                  </pic:nvPicPr>
+                  <pic:blipFill>
+                    <a:blip r:embed="rId8">
+                      <a:extLst>
+                        <a:ext uri="{28A0092B-C50C-407E-A947-70E740481C1C}">
+                          <a14:useLocalDpi xmlns:a14="http://schemas.microsoft.com/office/drawing/2010/main" val="0"/>
+                        </a:ext>
+                      </a:extLst>
+                    </a:blip>
+                    <a:stretch>
+                      <a:fillRect/>
+                    </a:stretch>
+                  </pic:blipFill>
+                  <pic:spPr>
+                    <a:xfrm>
+                      <a:off x="0" y="0"/>
+                      <a:ext cx="1613535" cy="1550670"/>
+                    </a:xfrm>
+                    <a:prstGeom prst="rect">
+                      <a:avLst/>
+                    </a:prstGeom>
+                    <a:ln w="3175" cap="sq" cmpd="thickThin">
+                      <a:solidFill>
+                        <a:srgbClr val="000000"/>
+                      </a:solidFill>
+                      <a:prstDash val="solid"/>
+                      <a:miter lim="800000"/>
+                    </a:ln>
+                    <a:effectLst>
+                      <a:innerShdw blurRad="76200">
+                        <a:srgbClr val="000000"/>
+                      </a:innerShdw>
+                    </a:effectLst>
+                  </pic:spPr>
+                </pic:pic>
+              </a:graphicData>
+            </a:graphic>
+            <wp14:sizeRelH relativeFrom="page">
+              <wp14:pctWidth>0</wp14:pctWidth>
+            </wp14:sizeRelH>
+            <wp14:sizeRelV relativeFrom="page">
+              <wp14:pctHeight>0</wp14:pctHeight>
+            </wp14:sizeRelV>
+          </wp:anchor>
+        </w:drawing>
+      </w:r>
       <w:r>
         <w:rPr>
           <w:rFonts w:ascii="Times New Roman" w:eastAsia="Times New Roman" w:hAnsi="Times New Roman" w:cs="Times New Roman"/>
           <w:b/>
           <w:bCs/>
           <w:kern w:val="0"/>
+          <w:lang w:eastAsia="en-IN"/>
+          <w14:ligatures w14:val="none"/>
+        </w:rPr>
+        <w:t>High-Level Architecture Flow:</w:t>
+      </w:r>
+    </w:p>
+    <w:p>
+      <w:pPr>
+        <w:spacing w:before="100" w:beforeAutospacing="1" w:after="100" w:afterAutospacing="1" w:line="240" w:lineRule="auto"/>
+        <w:rPr>
+          <w:rFonts w:ascii="Times New Roman" w:eastAsia="Times New Roman" w:hAnsi="Times New Roman" w:cs="Times New Roman"/>
+          <w:b/>
+          <w:bCs/>
+          <w:kern w:val="0"/>
+          <w:lang w:eastAsia="en-IN"/>
+          <w14:ligatures w14:val="none"/>
+        </w:rPr>
+      </w:pPr>
+    </w:p>
+    <w:p>
+      <w:pPr>
+        <w:spacing w:before="100" w:beforeAutospacing="1" w:after="100" w:afterAutospacing="1" w:line="240" w:lineRule="auto"/>
+        <w:rPr>
+          <w:rFonts w:ascii="Times New Roman" w:eastAsia="Times New Roman" w:hAnsi="Times New Roman" w:cs="Times New Roman"/>
+          <w:b/>
+          <w:bCs/>
+          <w:kern w:val="0"/>
+          <w:lang w:eastAsia="en-IN"/>
+          <w14:ligatures w14:val="none"/>
+        </w:rPr>
+      </w:pPr>
+    </w:p>
+    <w:p>
+      <w:pPr>
+        <w:spacing w:before="100" w:beforeAutospacing="1" w:after="100" w:afterAutospacing="1" w:line="240" w:lineRule="auto"/>
+        <w:rPr>
+          <w:rFonts w:ascii="Times New Roman" w:eastAsia="Times New Roman" w:hAnsi="Times New Roman" w:cs="Times New Roman"/>
+          <w:b/>
+          <w:bCs/>
+          <w:kern w:val="0"/>
+          <w:lang w:eastAsia="en-IN"/>
+          <w14:ligatures w14:val="none"/>
+        </w:rPr>
+      </w:pPr>
+    </w:p>
+    <w:p>
+      <w:pPr>
+        <w:spacing w:before="100" w:beforeAutospacing="1" w:after="100" w:afterAutospacing="1" w:line="240" w:lineRule="auto"/>
+        <w:rPr>
+          <w:rFonts w:ascii="Times New Roman" w:eastAsia="Times New Roman" w:hAnsi="Times New Roman" w:cs="Times New Roman"/>
+          <w:b/>
+          <w:bCs/>
+          <w:kern w:val="0"/>
+          <w:lang w:eastAsia="en-IN"/>
+          <w14:ligatures w14:val="none"/>
+        </w:rPr>
+      </w:pPr>
+      <w:r>
+        <w:rPr>
+          <w:rFonts w:ascii="Times New Roman" w:eastAsia="Times New Roman" w:hAnsi="Times New Roman" w:cs="Times New Roman"/>
+          <w:b/>
+          <w:bCs/>
+          <w:kern w:val="0"/>
+          <w:sz w:val="27"/>
+          <w:szCs w:val="27"/>
+          <w:lang w:eastAsia="en-IN"/>
+          <w14:ligatures w14:val="none"/>
+        </w:rPr>
+        <w:lastRenderedPageBreak/>
+        <w:t>12. API Contract (Phase 1 – Core Expense Management)</w:t>
+      </w:r>
+    </w:p>
+    <w:p>
+      <w:pPr>
+        <w:spacing w:before="100" w:beforeAutospacing="1" w:after="100" w:afterAutospacing="1" w:line="240" w:lineRule="auto"/>
+        <w:rPr>
+          <w:rFonts w:ascii="Times New Roman" w:eastAsia="Times New Roman" w:hAnsi="Times New Roman" w:cs="Times New Roman"/>
+          <w:kern w:val="0"/>
+          <w:lang w:eastAsia="en-IN"/>
+          <w14:ligatures w14:val="none"/>
+        </w:rPr>
+      </w:pPr>
+      <w:r>
+        <w:rPr>
+          <w:rFonts w:ascii="Times New Roman" w:eastAsia="Times New Roman" w:hAnsi="Times New Roman" w:cs="Times New Roman"/>
+          <w:kern w:val="0"/>
+          <w:lang w:eastAsia="en-IN"/>
+          <w14:ligatures w14:val="none"/>
+        </w:rPr>
+        <w:t>The following RESTful APIs define the interaction between the frontend and backend for the core expense management functionality.</w:t>
+      </w:r>
+    </w:p>
+    <w:p>
+      <w:pPr>
+        <w:spacing w:before="100" w:beforeAutospacing="1" w:after="100" w:afterAutospacing="1" w:line="240" w:lineRule="auto"/>
+        <w:rPr>
+          <w:rFonts w:ascii="Times New Roman" w:eastAsia="Times New Roman" w:hAnsi="Times New Roman" w:cs="Times New Roman"/>
+          <w:kern w:val="0"/>
+          <w:lang w:eastAsia="en-IN"/>
+          <w14:ligatures w14:val="none"/>
+        </w:rPr>
+      </w:pPr>
+      <w:r>
+        <w:rPr>
+          <w:rFonts w:ascii="Times New Roman" w:eastAsia="Times New Roman" w:hAnsi="Times New Roman" w:cs="Times New Roman"/>
+          <w:b/>
+          <w:bCs/>
+          <w:kern w:val="0"/>
+          <w:lang w:eastAsia="en-IN"/>
+          <w14:ligatures w14:val="none"/>
+        </w:rPr>
+        <w:t>POST /</w:t>
+      </w:r>
+      <w:proofErr w:type="spellStart"/>
+      <w:r>
+        <w:rPr>
+          <w:rFonts w:ascii="Times New Roman" w:eastAsia="Times New Roman" w:hAnsi="Times New Roman" w:cs="Times New Roman"/>
+          <w:b/>
+          <w:bCs/>
+          <w:kern w:val="0"/>
+          <w:lang w:eastAsia="en-IN"/>
+          <w14:ligatures w14:val="none"/>
+        </w:rPr>
+        <w:t>api</w:t>
+      </w:r>
+      <w:proofErr w:type="spellEnd"/>
+      <w:r>
+        <w:rPr>
+          <w:rFonts w:ascii="Times New Roman" w:eastAsia="Times New Roman" w:hAnsi="Times New Roman" w:cs="Times New Roman"/>
+          <w:b/>
+          <w:bCs/>
+          <w:kern w:val="0"/>
+          <w:lang w:eastAsia="en-IN"/>
+          <w14:ligatures w14:val="none"/>
+        </w:rPr>
+        <w:t>/expenses</w:t>
+      </w:r>
+    </w:p>
+    <w:p>
+      <w:pPr>
+        <w:spacing w:before="100" w:beforeAutospacing="1" w:after="100" w:afterAutospacing="1" w:line="240" w:lineRule="auto"/>
+        <w:rPr>
+          <w:rFonts w:ascii="Times New Roman" w:eastAsia="Times New Roman" w:hAnsi="Times New Roman" w:cs="Times New Roman"/>
+          <w:kern w:val="0"/>
+          <w:lang w:eastAsia="en-IN"/>
+          <w14:ligatures w14:val="none"/>
+        </w:rPr>
+      </w:pPr>
+      <w:r>
+        <w:rPr>
+          <w:rFonts w:ascii="Times New Roman" w:eastAsia="Times New Roman" w:hAnsi="Times New Roman" w:cs="Times New Roman"/>
+          <w:b/>
+          <w:bCs/>
+          <w:kern w:val="0"/>
+          <w:lang w:eastAsia="en-IN"/>
+          <w14:ligatures w14:val="none"/>
+        </w:rPr>
+        <w:t>Description:</w:t>
+      </w:r>
+      <w:r>
+        <w:rPr>
+          <w:rFonts w:ascii="Times New Roman" w:eastAsia="Times New Roman" w:hAnsi="Times New Roman" w:cs="Times New Roman"/>
+          <w:kern w:val="0"/>
+          <w:lang w:eastAsia="en-IN"/>
+          <w14:ligatures w14:val="none"/>
+        </w:rPr>
+        <w:t xml:space="preserve"> Add a new expense</w:t>
+      </w:r>
+      <w:r>
+        <w:rPr>
+          <w:rFonts w:ascii="Times New Roman" w:eastAsia="Times New Roman" w:hAnsi="Times New Roman" w:cs="Times New Roman"/>
+          <w:kern w:val="0"/>
+          <w:lang w:eastAsia="en-IN"/>
+          <w14:ligatures w14:val="none"/>
+        </w:rPr>
+        <w:br/>
+      </w:r>
+      <w:r>
+        <w:rPr>
+          <w:rFonts w:ascii="Times New Roman" w:eastAsia="Times New Roman" w:hAnsi="Times New Roman" w:cs="Times New Roman"/>
+          <w:b/>
+          <w:bCs/>
+          <w:kern w:val="0"/>
+          <w:lang w:eastAsia="en-IN"/>
+          <w14:ligatures w14:val="none"/>
+        </w:rPr>
+        <w:t>Request Body:</w:t>
+      </w:r>
+    </w:p>
+    <w:p>
+      <w:pPr>
+        <w:tabs>
+          <w:tab w:val="left" w:pos="916"/>
+          <w:tab w:val="left" w:pos="1832"/>
+          <w:tab w:val="left" w:pos="2748"/>
+          <w:tab w:val="left" w:pos="3664"/>
+          <w:tab w:val="left" w:pos="4580"/>
+          <w:tab w:val="left" w:pos="5496"/>
+          <w:tab w:val="left" w:pos="6412"/>
+          <w:tab w:val="left" w:pos="7328"/>
+          <w:tab w:val="left" w:pos="8244"/>
+          <w:tab w:val="left" w:pos="9160"/>
+          <w:tab w:val="left" w:pos="10076"/>
+          <w:tab w:val="left" w:pos="10992"/>
+          <w:tab w:val="left" w:pos="11908"/>
+          <w:tab w:val="left" w:pos="12824"/>
+          <w:tab w:val="left" w:pos="13740"/>
+          <w:tab w:val="left" w:pos="14656"/>
+        </w:tabs>
+        <w:spacing w:after="0" w:line="240" w:lineRule="auto"/>
+        <w:rPr>
+          <w:rFonts w:ascii="Courier New" w:eastAsia="Times New Roman" w:hAnsi="Courier New" w:cs="Courier New"/>
+          <w:kern w:val="0"/>
+          <w:sz w:val="20"/>
+          <w:szCs w:val="20"/>
+          <w:lang w:eastAsia="en-IN"/>
+          <w14:ligatures w14:val="none"/>
+        </w:rPr>
+      </w:pPr>
+      <w:r>
+        <w:rPr>
+          <w:rFonts w:ascii="Courier New" w:eastAsia="Times New Roman" w:hAnsi="Courier New" w:cs="Courier New"/>
+          <w:kern w:val="0"/>
+          <w:sz w:val="20"/>
+          <w:szCs w:val="20"/>
+          <w:lang w:eastAsia="en-IN"/>
+          <w14:ligatures w14:val="none"/>
+        </w:rPr>
+        <w:t>{</w:t>
+      </w:r>
+    </w:p>
+    <w:p>
+      <w:pPr>
+        <w:tabs>
+          <w:tab w:val="left" w:pos="916"/>
+          <w:tab w:val="left" w:pos="1832"/>
+          <w:tab w:val="left" w:pos="2748"/>
+          <w:tab w:val="left" w:pos="3664"/>
+          <w:tab w:val="left" w:pos="4580"/>
+          <w:tab w:val="left" w:pos="5496"/>
+          <w:tab w:val="left" w:pos="6412"/>
+          <w:tab w:val="left" w:pos="7328"/>
+          <w:tab w:val="left" w:pos="8244"/>
+          <w:tab w:val="left" w:pos="9160"/>
+          <w:tab w:val="left" w:pos="10076"/>
+          <w:tab w:val="left" w:pos="10992"/>
+          <w:tab w:val="left" w:pos="11908"/>
+          <w:tab w:val="left" w:pos="12824"/>
+          <w:tab w:val="left" w:pos="13740"/>
+          <w:tab w:val="left" w:pos="14656"/>
+        </w:tabs>
+        <w:spacing w:after="0" w:line="240" w:lineRule="auto"/>
+        <w:rPr>
+          <w:rFonts w:ascii="Courier New" w:eastAsia="Times New Roman" w:hAnsi="Courier New" w:cs="Courier New"/>
+          <w:kern w:val="0"/>
+          <w:sz w:val="20"/>
+          <w:szCs w:val="20"/>
+          <w:lang w:eastAsia="en-IN"/>
+          <w14:ligatures w14:val="none"/>
+        </w:rPr>
+      </w:pPr>
+      <w:r>
+        <w:rPr>
+          <w:rFonts w:ascii="Courier New" w:eastAsia="Times New Roman" w:hAnsi="Courier New" w:cs="Courier New"/>
+          <w:kern w:val="0"/>
+          <w:sz w:val="20"/>
+          <w:szCs w:val="20"/>
+          <w:lang w:eastAsia="en-IN"/>
+          <w14:ligatures w14:val="none"/>
+        </w:rPr>
+        <w:t xml:space="preserve">  "title": "Lunch",</w:t>
+      </w:r>
+    </w:p>
+    <w:p>
+      <w:pPr>
+        <w:tabs>
+          <w:tab w:val="left" w:pos="916"/>
+          <w:tab w:val="left" w:pos="1832"/>
+          <w:tab w:val="left" w:pos="2748"/>
+          <w:tab w:val="left" w:pos="3664"/>
+          <w:tab w:val="left" w:pos="4580"/>
+          <w:tab w:val="left" w:pos="5496"/>
+          <w:tab w:val="left" w:pos="6412"/>
+          <w:tab w:val="left" w:pos="7328"/>
+          <w:tab w:val="left" w:pos="8244"/>
+          <w:tab w:val="left" w:pos="9160"/>
+          <w:tab w:val="left" w:pos="10076"/>
+          <w:tab w:val="left" w:pos="10992"/>
+          <w:tab w:val="left" w:pos="11908"/>
+          <w:tab w:val="left" w:pos="12824"/>
+          <w:tab w:val="left" w:pos="13740"/>
+          <w:tab w:val="left" w:pos="14656"/>
+        </w:tabs>
+        <w:spacing w:after="0" w:line="240" w:lineRule="auto"/>
+        <w:rPr>
+          <w:rFonts w:ascii="Courier New" w:eastAsia="Times New Roman" w:hAnsi="Courier New" w:cs="Courier New"/>
+          <w:kern w:val="0"/>
+          <w:sz w:val="20"/>
+          <w:szCs w:val="20"/>
+          <w:lang w:eastAsia="en-IN"/>
+          <w14:ligatures w14:val="none"/>
+        </w:rPr>
+      </w:pPr>
+      <w:r>
+        <w:rPr>
+          <w:rFonts w:ascii="Courier New" w:eastAsia="Times New Roman" w:hAnsi="Courier New" w:cs="Courier New"/>
+          <w:kern w:val="0"/>
+          <w:sz w:val="20"/>
+          <w:szCs w:val="20"/>
+          <w:lang w:eastAsia="en-IN"/>
+          <w14:ligatures w14:val="none"/>
+        </w:rPr>
+        <w:t xml:space="preserve">  "amount": 150,</w:t>
+      </w:r>
+    </w:p>
+    <w:p>
+      <w:pPr>
+        <w:tabs>
+          <w:tab w:val="left" w:pos="916"/>
+          <w:tab w:val="left" w:pos="1832"/>
+          <w:tab w:val="left" w:pos="2748"/>
+          <w:tab w:val="left" w:pos="3664"/>
+          <w:tab w:val="left" w:pos="4580"/>
+          <w:tab w:val="left" w:pos="5496"/>
+          <w:tab w:val="left" w:pos="6412"/>
+          <w:tab w:val="left" w:pos="7328"/>
+          <w:tab w:val="left" w:pos="8244"/>
+          <w:tab w:val="left" w:pos="9160"/>
+          <w:tab w:val="left" w:pos="10076"/>
+          <w:tab w:val="left" w:pos="10992"/>
+          <w:tab w:val="left" w:pos="11908"/>
+          <w:tab w:val="left" w:pos="12824"/>
+          <w:tab w:val="left" w:pos="13740"/>
+          <w:tab w:val="left" w:pos="14656"/>
+        </w:tabs>
+        <w:spacing w:after="0" w:line="240" w:lineRule="auto"/>
+        <w:rPr>
+          <w:rFonts w:ascii="Courier New" w:eastAsia="Times New Roman" w:hAnsi="Courier New" w:cs="Courier New"/>
+          <w:kern w:val="0"/>
+          <w:sz w:val="20"/>
+          <w:szCs w:val="20"/>
+          <w:lang w:eastAsia="en-IN"/>
+          <w14:ligatures w14:val="none"/>
+        </w:rPr>
+      </w:pPr>
+      <w:r>
+        <w:rPr>
+          <w:rFonts w:ascii="Courier New" w:eastAsia="Times New Roman" w:hAnsi="Courier New" w:cs="Courier New"/>
+          <w:kern w:val="0"/>
+          <w:sz w:val="20"/>
+          <w:szCs w:val="20"/>
+          <w:lang w:eastAsia="en-IN"/>
+          <w14:ligatures w14:val="none"/>
+        </w:rPr>
+        <w:t xml:space="preserve">  "category": "Food",</w:t>
+      </w:r>
+    </w:p>
+    <w:p>
+      <w:pPr>
+        <w:tabs>
+          <w:tab w:val="left" w:pos="916"/>
+          <w:tab w:val="left" w:pos="1832"/>
+          <w:tab w:val="left" w:pos="2748"/>
+          <w:tab w:val="left" w:pos="3664"/>
+          <w:tab w:val="left" w:pos="4580"/>
+          <w:tab w:val="left" w:pos="5496"/>
+          <w:tab w:val="left" w:pos="6412"/>
+          <w:tab w:val="left" w:pos="7328"/>
+          <w:tab w:val="left" w:pos="8244"/>
+          <w:tab w:val="left" w:pos="9160"/>
+          <w:tab w:val="left" w:pos="10076"/>
+          <w:tab w:val="left" w:pos="10992"/>
+          <w:tab w:val="left" w:pos="11908"/>
+          <w:tab w:val="left" w:pos="12824"/>
+          <w:tab w:val="left" w:pos="13740"/>
+          <w:tab w:val="left" w:pos="14656"/>
+        </w:tabs>
+        <w:spacing w:after="0" w:line="240" w:lineRule="auto"/>
+        <w:rPr>
+          <w:rFonts w:ascii="Courier New" w:eastAsia="Times New Roman" w:hAnsi="Courier New" w:cs="Courier New"/>
+          <w:kern w:val="0"/>
+          <w:sz w:val="20"/>
+          <w:szCs w:val="20"/>
+          <w:lang w:eastAsia="en-IN"/>
+          <w14:ligatures w14:val="none"/>
+        </w:rPr>
+      </w:pPr>
+      <w:r>
+        <w:rPr>
+          <w:rFonts w:ascii="Courier New" w:eastAsia="Times New Roman" w:hAnsi="Courier New" w:cs="Courier New"/>
+          <w:kern w:val="0"/>
+          <w:sz w:val="20"/>
+          <w:szCs w:val="20"/>
+          <w:lang w:eastAsia="en-IN"/>
+          <w14:ligatures w14:val="none"/>
+        </w:rPr>
+        <w:t xml:space="preserve">  "date": "2026-02-06"</w:t>
+      </w:r>
+    </w:p>
+    <w:p>
+      <w:pPr>
+        <w:tabs>
+          <w:tab w:val="left" w:pos="916"/>
+          <w:tab w:val="left" w:pos="1832"/>
+          <w:tab w:val="left" w:pos="2748"/>
+          <w:tab w:val="left" w:pos="3664"/>
+          <w:tab w:val="left" w:pos="4580"/>
+          <w:tab w:val="left" w:pos="5496"/>
+          <w:tab w:val="left" w:pos="6412"/>
+          <w:tab w:val="left" w:pos="7328"/>
+          <w:tab w:val="left" w:pos="8244"/>
+          <w:tab w:val="left" w:pos="9160"/>
+          <w:tab w:val="left" w:pos="10076"/>
+          <w:tab w:val="left" w:pos="10992"/>
+          <w:tab w:val="left" w:pos="11908"/>
+          <w:tab w:val="left" w:pos="12824"/>
+          <w:tab w:val="left" w:pos="13740"/>
+          <w:tab w:val="left" w:pos="14656"/>
+        </w:tabs>
+        <w:spacing w:after="0" w:line="240" w:lineRule="auto"/>
+        <w:rPr>
+          <w:rFonts w:ascii="Courier New" w:eastAsia="Times New Roman" w:hAnsi="Courier New" w:cs="Courier New"/>
+          <w:kern w:val="0"/>
+          <w:sz w:val="20"/>
+          <w:szCs w:val="20"/>
+          <w:lang w:eastAsia="en-IN"/>
+          <w14:ligatures w14:val="none"/>
+        </w:rPr>
+      </w:pPr>
+      <w:r>
+        <w:rPr>
+          <w:rFonts w:ascii="Courier New" w:eastAsia="Times New Roman" w:hAnsi="Courier New" w:cs="Courier New"/>
+          <w:kern w:val="0"/>
+          <w:sz w:val="20"/>
+          <w:szCs w:val="20"/>
+          <w:lang w:eastAsia="en-IN"/>
+          <w14:ligatures w14:val="none"/>
+        </w:rPr>
+        <w:t>}</w:t>
+      </w:r>
+    </w:p>
+    <w:p>
+      <w:pPr>
+        <w:spacing w:before="100" w:beforeAutospacing="1" w:after="100" w:afterAutospacing="1" w:line="240" w:lineRule="auto"/>
+        <w:rPr>
+          <w:rFonts w:ascii="Times New Roman" w:eastAsia="Times New Roman" w:hAnsi="Times New Roman" w:cs="Times New Roman"/>
+          <w:kern w:val="0"/>
+          <w:lang w:eastAsia="en-IN"/>
+          <w14:ligatures w14:val="none"/>
+        </w:rPr>
+      </w:pPr>
+      <w:r>
+        <w:rPr>
+          <w:rFonts w:ascii="Times New Roman" w:eastAsia="Times New Roman" w:hAnsi="Times New Roman" w:cs="Times New Roman"/>
+          <w:b/>
+          <w:bCs/>
+          <w:kern w:val="0"/>
+          <w:lang w:eastAsia="en-IN"/>
+          <w14:ligatures w14:val="none"/>
+        </w:rPr>
+        <w:t>Response:</w:t>
+      </w:r>
+    </w:p>
+    <w:p>
+      <w:pPr>
+        <w:tabs>
+          <w:tab w:val="left" w:pos="916"/>
+          <w:tab w:val="left" w:pos="1832"/>
+          <w:tab w:val="left" w:pos="2748"/>
+          <w:tab w:val="left" w:pos="3664"/>
+          <w:tab w:val="left" w:pos="4580"/>
+          <w:tab w:val="left" w:pos="5496"/>
+          <w:tab w:val="left" w:pos="6412"/>
+          <w:tab w:val="left" w:pos="7328"/>
+          <w:tab w:val="left" w:pos="8244"/>
+          <w:tab w:val="left" w:pos="9160"/>
+          <w:tab w:val="left" w:pos="10076"/>
+          <w:tab w:val="left" w:pos="10992"/>
+          <w:tab w:val="left" w:pos="11908"/>
+          <w:tab w:val="left" w:pos="12824"/>
+          <w:tab w:val="left" w:pos="13740"/>
+          <w:tab w:val="left" w:pos="14656"/>
+        </w:tabs>
+        <w:spacing w:after="0" w:line="240" w:lineRule="auto"/>
+        <w:rPr>
+          <w:rFonts w:ascii="Courier New" w:eastAsia="Times New Roman" w:hAnsi="Courier New" w:cs="Courier New"/>
+          <w:kern w:val="0"/>
+          <w:sz w:val="20"/>
+          <w:szCs w:val="20"/>
+          <w:lang w:eastAsia="en-IN"/>
+          <w14:ligatures w14:val="none"/>
+        </w:rPr>
+      </w:pPr>
+      <w:r>
+        <w:rPr>
+          <w:rFonts w:ascii="Courier New" w:eastAsia="Times New Roman" w:hAnsi="Courier New" w:cs="Courier New"/>
+          <w:kern w:val="0"/>
+          <w:sz w:val="20"/>
+          <w:szCs w:val="20"/>
+          <w:lang w:eastAsia="en-IN"/>
+          <w14:ligatures w14:val="none"/>
+        </w:rPr>
+        <w:t>{</w:t>
+      </w:r>
+    </w:p>
+    <w:p>
+      <w:pPr>
+        <w:tabs>
+          <w:tab w:val="left" w:pos="916"/>
+          <w:tab w:val="left" w:pos="1832"/>
+          <w:tab w:val="left" w:pos="2748"/>
+          <w:tab w:val="left" w:pos="3664"/>
+          <w:tab w:val="left" w:pos="4580"/>
+          <w:tab w:val="left" w:pos="5496"/>
+          <w:tab w:val="left" w:pos="6412"/>
+          <w:tab w:val="left" w:pos="7328"/>
+          <w:tab w:val="left" w:pos="8244"/>
+          <w:tab w:val="left" w:pos="9160"/>
+          <w:tab w:val="left" w:pos="10076"/>
+          <w:tab w:val="left" w:pos="10992"/>
+          <w:tab w:val="left" w:pos="11908"/>
+          <w:tab w:val="left" w:pos="12824"/>
+          <w:tab w:val="left" w:pos="13740"/>
+          <w:tab w:val="left" w:pos="14656"/>
+        </w:tabs>
+        <w:spacing w:after="0" w:line="240" w:lineRule="auto"/>
+        <w:rPr>
+          <w:rFonts w:ascii="Courier New" w:eastAsia="Times New Roman" w:hAnsi="Courier New" w:cs="Courier New"/>
+          <w:kern w:val="0"/>
+          <w:sz w:val="20"/>
+          <w:szCs w:val="20"/>
+          <w:lang w:eastAsia="en-IN"/>
+          <w14:ligatures w14:val="none"/>
+        </w:rPr>
+      </w:pPr>
+      <w:r>
+        <w:rPr>
+          <w:rFonts w:ascii="Courier New" w:eastAsia="Times New Roman" w:hAnsi="Courier New" w:cs="Courier New"/>
+          <w:kern w:val="0"/>
+          <w:sz w:val="20"/>
+          <w:szCs w:val="20"/>
+          <w:lang w:eastAsia="en-IN"/>
+          <w14:ligatures w14:val="none"/>
+        </w:rPr>
+        <w:t xml:space="preserve">  "success": true,</w:t>
+      </w:r>
+    </w:p>
+    <w:p>
+      <w:pPr>
+        <w:tabs>
+          <w:tab w:val="left" w:pos="916"/>
+          <w:tab w:val="left" w:pos="1832"/>
+          <w:tab w:val="left" w:pos="2748"/>
+          <w:tab w:val="left" w:pos="3664"/>
+          <w:tab w:val="left" w:pos="4580"/>
+          <w:tab w:val="left" w:pos="5496"/>
+          <w:tab w:val="left" w:pos="6412"/>
+          <w:tab w:val="left" w:pos="7328"/>
+          <w:tab w:val="left" w:pos="8244"/>
+          <w:tab w:val="left" w:pos="9160"/>
+          <w:tab w:val="left" w:pos="10076"/>
+          <w:tab w:val="left" w:pos="10992"/>
+          <w:tab w:val="left" w:pos="11908"/>
+          <w:tab w:val="left" w:pos="12824"/>
+          <w:tab w:val="left" w:pos="13740"/>
+          <w:tab w:val="left" w:pos="14656"/>
+        </w:tabs>
+        <w:spacing w:after="0" w:line="240" w:lineRule="auto"/>
+        <w:rPr>
+          <w:rFonts w:ascii="Courier New" w:eastAsia="Times New Roman" w:hAnsi="Courier New" w:cs="Courier New"/>
+          <w:kern w:val="0"/>
+          <w:sz w:val="20"/>
+          <w:szCs w:val="20"/>
+          <w:lang w:eastAsia="en-IN"/>
+          <w14:ligatures w14:val="none"/>
+        </w:rPr>
+      </w:pPr>
+      <w:r>
+        <w:rPr>
+          <w:rFonts w:ascii="Courier New" w:eastAsia="Times New Roman" w:hAnsi="Courier New" w:cs="Courier New"/>
+          <w:kern w:val="0"/>
+          <w:sz w:val="20"/>
+          <w:szCs w:val="20"/>
+          <w:lang w:eastAsia="en-IN"/>
+          <w14:ligatures w14:val="none"/>
+        </w:rPr>
+        <w:t xml:space="preserve">  "message": "Expense added successfully"</w:t>
+      </w:r>
+    </w:p>
+    <w:p>
+      <w:pPr>
+        <w:tabs>
+          <w:tab w:val="left" w:pos="916"/>
+          <w:tab w:val="left" w:pos="1832"/>
+          <w:tab w:val="left" w:pos="2748"/>
+          <w:tab w:val="left" w:pos="3664"/>
+          <w:tab w:val="left" w:pos="4580"/>
+          <w:tab w:val="left" w:pos="5496"/>
+          <w:tab w:val="left" w:pos="6412"/>
+          <w:tab w:val="left" w:pos="7328"/>
+          <w:tab w:val="left" w:pos="8244"/>
+          <w:tab w:val="left" w:pos="9160"/>
+          <w:tab w:val="left" w:pos="10076"/>
+          <w:tab w:val="left" w:pos="10992"/>
+          <w:tab w:val="left" w:pos="11908"/>
+          <w:tab w:val="left" w:pos="12824"/>
+          <w:tab w:val="left" w:pos="13740"/>
+          <w:tab w:val="left" w:pos="14656"/>
+        </w:tabs>
+        <w:spacing w:after="0" w:line="240" w:lineRule="auto"/>
+        <w:rPr>
+          <w:rFonts w:ascii="Courier New" w:eastAsia="Times New Roman" w:hAnsi="Courier New" w:cs="Courier New"/>
+          <w:kern w:val="0"/>
+          <w:sz w:val="20"/>
+          <w:szCs w:val="20"/>
+          <w:lang w:eastAsia="en-IN"/>
+          <w14:ligatures w14:val="none"/>
+        </w:rPr>
+      </w:pPr>
+      <w:r>
+        <w:rPr>
+          <w:rFonts w:ascii="Courier New" w:eastAsia="Times New Roman" w:hAnsi="Courier New" w:cs="Courier New"/>
+          <w:kern w:val="0"/>
+          <w:sz w:val="20"/>
+          <w:szCs w:val="20"/>
+          <w:lang w:eastAsia="en-IN"/>
+          <w14:ligatures w14:val="none"/>
+        </w:rPr>
+        <w:t>}</w:t>
+      </w:r>
+    </w:p>
+    <w:p>
+      <w:pPr>
+        <w:tabs>
+          <w:tab w:val="left" w:pos="916"/>
+          <w:tab w:val="left" w:pos="1832"/>
+          <w:tab w:val="left" w:pos="2748"/>
+          <w:tab w:val="left" w:pos="3664"/>
+          <w:tab w:val="left" w:pos="4580"/>
+          <w:tab w:val="left" w:pos="5496"/>
+          <w:tab w:val="left" w:pos="6412"/>
+          <w:tab w:val="left" w:pos="7328"/>
+          <w:tab w:val="left" w:pos="8244"/>
+          <w:tab w:val="left" w:pos="9160"/>
+          <w:tab w:val="left" w:pos="10076"/>
+          <w:tab w:val="left" w:pos="10992"/>
+          <w:tab w:val="left" w:pos="11908"/>
+          <w:tab w:val="left" w:pos="12824"/>
+          <w:tab w:val="left" w:pos="13740"/>
+          <w:tab w:val="left" w:pos="14656"/>
+        </w:tabs>
+        <w:spacing w:after="0" w:line="240" w:lineRule="auto"/>
+        <w:rPr>
+          <w:rFonts w:ascii="Times New Roman" w:eastAsia="Times New Roman" w:hAnsi="Times New Roman" w:cs="Times New Roman"/>
+          <w:b/>
+          <w:bCs/>
+          <w:kern w:val="0"/>
+          <w:lang w:eastAsia="en-IN"/>
+          <w14:ligatures w14:val="none"/>
+        </w:rPr>
+      </w:pPr>
+    </w:p>
+    <w:p>
+      <w:pPr>
+        <w:tabs>
+          <w:tab w:val="left" w:pos="916"/>
+          <w:tab w:val="left" w:pos="1832"/>
+          <w:tab w:val="left" w:pos="2748"/>
+          <w:tab w:val="left" w:pos="3664"/>
+          <w:tab w:val="left" w:pos="4580"/>
+          <w:tab w:val="left" w:pos="5496"/>
+          <w:tab w:val="left" w:pos="6412"/>
+          <w:tab w:val="left" w:pos="7328"/>
+          <w:tab w:val="left" w:pos="8244"/>
+          <w:tab w:val="left" w:pos="9160"/>
+          <w:tab w:val="left" w:pos="10076"/>
+          <w:tab w:val="left" w:pos="10992"/>
+          <w:tab w:val="left" w:pos="11908"/>
+          <w:tab w:val="left" w:pos="12824"/>
+          <w:tab w:val="left" w:pos="13740"/>
+          <w:tab w:val="left" w:pos="14656"/>
+        </w:tabs>
+        <w:spacing w:after="0" w:line="240" w:lineRule="auto"/>
+        <w:rPr>
+          <w:rFonts w:ascii="Courier New" w:eastAsia="Times New Roman" w:hAnsi="Courier New" w:cs="Courier New"/>
+          <w:kern w:val="0"/>
+          <w:sz w:val="20"/>
+          <w:szCs w:val="20"/>
+          <w:lang w:eastAsia="en-IN"/>
+          <w14:ligatures w14:val="none"/>
+        </w:rPr>
+      </w:pPr>
+      <w:r>
+        <w:rPr>
+          <w:rFonts w:ascii="Times New Roman" w:eastAsia="Times New Roman" w:hAnsi="Times New Roman" w:cs="Times New Roman"/>
+          <w:b/>
+          <w:bCs/>
+          <w:kern w:val="0"/>
+          <w:lang w:eastAsia="en-IN"/>
+          <w14:ligatures w14:val="none"/>
+        </w:rPr>
+        <w:t>GET /</w:t>
+      </w:r>
+      <w:proofErr w:type="spellStart"/>
+      <w:r>
+        <w:rPr>
+          <w:rFonts w:ascii="Times New Roman" w:eastAsia="Times New Roman" w:hAnsi="Times New Roman" w:cs="Times New Roman"/>
+          <w:b/>
+          <w:bCs/>
+          <w:kern w:val="0"/>
+          <w:lang w:eastAsia="en-IN"/>
+          <w14:ligatures w14:val="none"/>
+        </w:rPr>
+        <w:t>api</w:t>
+      </w:r>
+      <w:proofErr w:type="spellEnd"/>
+      <w:r>
+        <w:rPr>
+          <w:rFonts w:ascii="Times New Roman" w:eastAsia="Times New Roman" w:hAnsi="Times New Roman" w:cs="Times New Roman"/>
+          <w:b/>
+          <w:bCs/>
+          <w:kern w:val="0"/>
+          <w:lang w:eastAsia="en-IN"/>
+          <w14:ligatures w14:val="none"/>
+        </w:rPr>
+        <w:t>/expenses</w:t>
+      </w:r>
+    </w:p>
+    <w:p>
+      <w:pPr>
+        <w:spacing w:before="100" w:beforeAutospacing="1" w:after="100" w:afterAutospacing="1" w:line="240" w:lineRule="auto"/>
+        <w:rPr>
+          <w:rFonts w:ascii="Times New Roman" w:eastAsia="Times New Roman" w:hAnsi="Times New Roman" w:cs="Times New Roman"/>
+          <w:kern w:val="0"/>
+          <w:lang w:eastAsia="en-IN"/>
+          <w14:ligatures w14:val="none"/>
+        </w:rPr>
+      </w:pPr>
+      <w:r>
+        <w:rPr>
+          <w:rFonts w:ascii="Times New Roman" w:eastAsia="Times New Roman" w:hAnsi="Times New Roman" w:cs="Times New Roman"/>
+          <w:b/>
+          <w:bCs/>
+          <w:kern w:val="0"/>
+          <w:lang w:eastAsia="en-IN"/>
+          <w14:ligatures w14:val="none"/>
+        </w:rPr>
+        <w:t>Description:</w:t>
+      </w:r>
+      <w:r>
+        <w:rPr>
+          <w:rFonts w:ascii="Times New Roman" w:eastAsia="Times New Roman" w:hAnsi="Times New Roman" w:cs="Times New Roman"/>
+          <w:kern w:val="0"/>
+          <w:lang w:eastAsia="en-IN"/>
+          <w14:ligatures w14:val="none"/>
+        </w:rPr>
+        <w:t xml:space="preserve"> Retrieve all expenses</w:t>
+      </w:r>
+    </w:p>
+    <w:p>
+      <w:pPr>
+        <w:spacing w:before="100" w:beforeAutospacing="1" w:after="100" w:afterAutospacing="1" w:line="240" w:lineRule="auto"/>
+        <w:rPr>
+          <w:rFonts w:ascii="Times New Roman" w:eastAsia="Times New Roman" w:hAnsi="Times New Roman" w:cs="Times New Roman"/>
+          <w:kern w:val="0"/>
+          <w:lang w:eastAsia="en-IN"/>
+          <w14:ligatures w14:val="none"/>
+        </w:rPr>
+      </w:pPr>
+      <w:r>
+        <w:rPr>
+          <w:rFonts w:ascii="Times New Roman" w:eastAsia="Times New Roman" w:hAnsi="Times New Roman" w:cs="Times New Roman"/>
+          <w:b/>
+          <w:bCs/>
+          <w:kern w:val="0"/>
+          <w:lang w:eastAsia="en-IN"/>
+          <w14:ligatures w14:val="none"/>
+        </w:rPr>
+        <w:t>Response:</w:t>
+      </w:r>
+    </w:p>
+    <w:p>
+      <w:pPr>
+        <w:tabs>
+          <w:tab w:val="left" w:pos="916"/>
+          <w:tab w:val="left" w:pos="1832"/>
+          <w:tab w:val="left" w:pos="2748"/>
+          <w:tab w:val="left" w:pos="3664"/>
+          <w:tab w:val="left" w:pos="4580"/>
+          <w:tab w:val="left" w:pos="5496"/>
+          <w:tab w:val="left" w:pos="6412"/>
+          <w:tab w:val="left" w:pos="7328"/>
+          <w:tab w:val="left" w:pos="8244"/>
+          <w:tab w:val="left" w:pos="9160"/>
+          <w:tab w:val="left" w:pos="10076"/>
+          <w:tab w:val="left" w:pos="10992"/>
+          <w:tab w:val="left" w:pos="11908"/>
+          <w:tab w:val="left" w:pos="12824"/>
+          <w:tab w:val="left" w:pos="13740"/>
+          <w:tab w:val="left" w:pos="14656"/>
+        </w:tabs>
+        <w:spacing w:after="0" w:line="240" w:lineRule="auto"/>
+        <w:rPr>
+          <w:rFonts w:ascii="Courier New" w:eastAsia="Times New Roman" w:hAnsi="Courier New" w:cs="Courier New"/>
+          <w:kern w:val="0"/>
+          <w:sz w:val="20"/>
+          <w:szCs w:val="20"/>
+          <w:lang w:eastAsia="en-IN"/>
+          <w14:ligatures w14:val="none"/>
+        </w:rPr>
+      </w:pPr>
+      <w:r>
+        <w:rPr>
+          <w:rFonts w:ascii="Courier New" w:eastAsia="Times New Roman" w:hAnsi="Courier New" w:cs="Courier New"/>
+          <w:kern w:val="0"/>
+          <w:sz w:val="20"/>
+          <w:szCs w:val="20"/>
+          <w:lang w:eastAsia="en-IN"/>
+          <w14:ligatures w14:val="none"/>
+        </w:rPr>
+        <w:t>{</w:t>
+      </w:r>
+    </w:p>
+    <w:p>
+      <w:pPr>
+        <w:tabs>
+          <w:tab w:val="left" w:pos="916"/>
+          <w:tab w:val="left" w:pos="1832"/>
+          <w:tab w:val="left" w:pos="2748"/>
+          <w:tab w:val="left" w:pos="3664"/>
+          <w:tab w:val="left" w:pos="4580"/>
+          <w:tab w:val="left" w:pos="5496"/>
+          <w:tab w:val="left" w:pos="6412"/>
+          <w:tab w:val="left" w:pos="7328"/>
+          <w:tab w:val="left" w:pos="8244"/>
+          <w:tab w:val="left" w:pos="9160"/>
+          <w:tab w:val="left" w:pos="10076"/>
+          <w:tab w:val="left" w:pos="10992"/>
+          <w:tab w:val="left" w:pos="11908"/>
+          <w:tab w:val="left" w:pos="12824"/>
+          <w:tab w:val="left" w:pos="13740"/>
+          <w:tab w:val="left" w:pos="14656"/>
+        </w:tabs>
+        <w:spacing w:after="0" w:line="240" w:lineRule="auto"/>
+        <w:rPr>
+          <w:rFonts w:ascii="Courier New" w:eastAsia="Times New Roman" w:hAnsi="Courier New" w:cs="Courier New"/>
+          <w:kern w:val="0"/>
+          <w:sz w:val="20"/>
+          <w:szCs w:val="20"/>
+          <w:lang w:eastAsia="en-IN"/>
+          <w14:ligatures w14:val="none"/>
+        </w:rPr>
+      </w:pPr>
+      <w:r>
+        <w:rPr>
+          <w:rFonts w:ascii="Courier New" w:eastAsia="Times New Roman" w:hAnsi="Courier New" w:cs="Courier New"/>
+          <w:kern w:val="0"/>
+          <w:sz w:val="20"/>
+          <w:szCs w:val="20"/>
+          <w:lang w:eastAsia="en-IN"/>
+          <w14:ligatures w14:val="none"/>
+        </w:rPr>
+        <w:t xml:space="preserve">  "success": true,</w:t>
+      </w:r>
+    </w:p>
+    <w:p>
+      <w:pPr>
+        <w:tabs>
+          <w:tab w:val="left" w:pos="916"/>
+          <w:tab w:val="left" w:pos="1832"/>
+          <w:tab w:val="left" w:pos="2748"/>
+          <w:tab w:val="left" w:pos="3664"/>
+          <w:tab w:val="left" w:pos="4580"/>
+          <w:tab w:val="left" w:pos="5496"/>
+          <w:tab w:val="left" w:pos="6412"/>
+          <w:tab w:val="left" w:pos="7328"/>
+          <w:tab w:val="left" w:pos="8244"/>
+          <w:tab w:val="left" w:pos="9160"/>
+          <w:tab w:val="left" w:pos="10076"/>
+          <w:tab w:val="left" w:pos="10992"/>
+          <w:tab w:val="left" w:pos="11908"/>
+          <w:tab w:val="left" w:pos="12824"/>
+          <w:tab w:val="left" w:pos="13740"/>
+          <w:tab w:val="left" w:pos="14656"/>
+        </w:tabs>
+        <w:spacing w:after="0" w:line="240" w:lineRule="auto"/>
+        <w:rPr>
+          <w:rFonts w:ascii="Courier New" w:eastAsia="Times New Roman" w:hAnsi="Courier New" w:cs="Courier New"/>
+          <w:kern w:val="0"/>
+          <w:sz w:val="20"/>
+          <w:szCs w:val="20"/>
+          <w:lang w:eastAsia="en-IN"/>
+          <w14:ligatures w14:val="none"/>
+        </w:rPr>
+      </w:pPr>
+      <w:r>
+        <w:rPr>
+          <w:rFonts w:ascii="Courier New" w:eastAsia="Times New Roman" w:hAnsi="Courier New" w:cs="Courier New"/>
+          <w:kern w:val="0"/>
+          <w:sz w:val="20"/>
+          <w:szCs w:val="20"/>
+          <w:lang w:eastAsia="en-IN"/>
+          <w14:ligatures w14:val="none"/>
+        </w:rPr>
+        <w:t xml:space="preserve">  "expenses": [</w:t>
+      </w:r>
+    </w:p>
+    <w:p>
+      <w:pPr>
+        <w:tabs>
+          <w:tab w:val="left" w:pos="916"/>
+          <w:tab w:val="left" w:pos="1832"/>
+          <w:tab w:val="left" w:pos="2748"/>
+          <w:tab w:val="left" w:pos="3664"/>
+          <w:tab w:val="left" w:pos="4580"/>
+          <w:tab w:val="left" w:pos="5496"/>
+          <w:tab w:val="left" w:pos="6412"/>
+          <w:tab w:val="left" w:pos="7328"/>
+          <w:tab w:val="left" w:pos="8244"/>
+          <w:tab w:val="left" w:pos="9160"/>
+          <w:tab w:val="left" w:pos="10076"/>
+          <w:tab w:val="left" w:pos="10992"/>
+          <w:tab w:val="left" w:pos="11908"/>
+          <w:tab w:val="left" w:pos="12824"/>
+          <w:tab w:val="left" w:pos="13740"/>
+          <w:tab w:val="left" w:pos="14656"/>
+        </w:tabs>
+        <w:spacing w:after="0" w:line="240" w:lineRule="auto"/>
+        <w:rPr>
+          <w:rFonts w:ascii="Courier New" w:eastAsia="Times New Roman" w:hAnsi="Courier New" w:cs="Courier New"/>
+          <w:kern w:val="0"/>
+          <w:sz w:val="20"/>
+          <w:szCs w:val="20"/>
+          <w:lang w:eastAsia="en-IN"/>
+          <w14:ligatures w14:val="none"/>
+        </w:rPr>
+      </w:pPr>
+      <w:r>
+        <w:rPr>
+          <w:rFonts w:ascii="Courier New" w:eastAsia="Times New Roman" w:hAnsi="Courier New" w:cs="Courier New"/>
+          <w:kern w:val="0"/>
+          <w:sz w:val="20"/>
+          <w:szCs w:val="20"/>
+          <w:lang w:eastAsia="en-IN"/>
+          <w14:ligatures w14:val="none"/>
+        </w:rPr>
+        <w:t xml:space="preserve">    {</w:t>
+      </w:r>
+    </w:p>
+    <w:p>
+      <w:pPr>
+        <w:tabs>
+          <w:tab w:val="left" w:pos="916"/>
+          <w:tab w:val="left" w:pos="1832"/>
+          <w:tab w:val="left" w:pos="2748"/>
+          <w:tab w:val="left" w:pos="3664"/>
+          <w:tab w:val="left" w:pos="4580"/>
+          <w:tab w:val="left" w:pos="5496"/>
+          <w:tab w:val="left" w:pos="6412"/>
+          <w:tab w:val="left" w:pos="7328"/>
+          <w:tab w:val="left" w:pos="8244"/>
+          <w:tab w:val="left" w:pos="9160"/>
+          <w:tab w:val="left" w:pos="10076"/>
+          <w:tab w:val="left" w:pos="10992"/>
+          <w:tab w:val="left" w:pos="11908"/>
+          <w:tab w:val="left" w:pos="12824"/>
+          <w:tab w:val="left" w:pos="13740"/>
+          <w:tab w:val="left" w:pos="14656"/>
+        </w:tabs>
+        <w:spacing w:after="0" w:line="240" w:lineRule="auto"/>
+        <w:rPr>
+          <w:rFonts w:ascii="Courier New" w:eastAsia="Times New Roman" w:hAnsi="Courier New" w:cs="Courier New"/>
+          <w:kern w:val="0"/>
+          <w:sz w:val="20"/>
+          <w:szCs w:val="20"/>
+          <w:lang w:eastAsia="en-IN"/>
+          <w14:ligatures w14:val="none"/>
+        </w:rPr>
+      </w:pPr>
+      <w:r>
+        <w:rPr>
+          <w:rFonts w:ascii="Courier New" w:eastAsia="Times New Roman" w:hAnsi="Courier New" w:cs="Courier New"/>
+          <w:kern w:val="0"/>
+          <w:sz w:val="20"/>
+          <w:szCs w:val="20"/>
+          <w:lang w:eastAsia="en-IN"/>
+          <w14:ligatures w14:val="none"/>
+        </w:rPr>
+        <w:t xml:space="preserve">      "id": "1",</w:t>
+      </w:r>
+    </w:p>
+    <w:p>
+      <w:pPr>
+        <w:tabs>
+          <w:tab w:val="left" w:pos="916"/>
+          <w:tab w:val="left" w:pos="1832"/>
+          <w:tab w:val="left" w:pos="2748"/>
+          <w:tab w:val="left" w:pos="3664"/>
+          <w:tab w:val="left" w:pos="4580"/>
+          <w:tab w:val="left" w:pos="5496"/>
+          <w:tab w:val="left" w:pos="6412"/>
+          <w:tab w:val="left" w:pos="7328"/>
+          <w:tab w:val="left" w:pos="8244"/>
+          <w:tab w:val="left" w:pos="9160"/>
+          <w:tab w:val="left" w:pos="10076"/>
+          <w:tab w:val="left" w:pos="10992"/>
+          <w:tab w:val="left" w:pos="11908"/>
+          <w:tab w:val="left" w:pos="12824"/>
+          <w:tab w:val="left" w:pos="13740"/>
+          <w:tab w:val="left" w:pos="14656"/>
+        </w:tabs>
+        <w:spacing w:after="0" w:line="240" w:lineRule="auto"/>
+        <w:rPr>
+          <w:rFonts w:ascii="Courier New" w:eastAsia="Times New Roman" w:hAnsi="Courier New" w:cs="Courier New"/>
+          <w:kern w:val="0"/>
+          <w:sz w:val="20"/>
+          <w:szCs w:val="20"/>
+          <w:lang w:eastAsia="en-IN"/>
+          <w14:ligatures w14:val="none"/>
+        </w:rPr>
+      </w:pPr>
+      <w:r>
+        <w:rPr>
+          <w:rFonts w:ascii="Courier New" w:eastAsia="Times New Roman" w:hAnsi="Courier New" w:cs="Courier New"/>
+          <w:kern w:val="0"/>
+          <w:sz w:val="20"/>
+          <w:szCs w:val="20"/>
+          <w:lang w:eastAsia="en-IN"/>
+          <w14:ligatures w14:val="none"/>
+        </w:rPr>
+        <w:t xml:space="preserve">      "title": "Lunch",</w:t>
+      </w:r>
+    </w:p>
+    <w:p>
+      <w:pPr>
+        <w:tabs>
+          <w:tab w:val="left" w:pos="916"/>
+          <w:tab w:val="left" w:pos="1832"/>
+          <w:tab w:val="left" w:pos="2748"/>
+          <w:tab w:val="left" w:pos="3664"/>
+          <w:tab w:val="left" w:pos="4580"/>
+          <w:tab w:val="left" w:pos="5496"/>
+          <w:tab w:val="left" w:pos="6412"/>
+          <w:tab w:val="left" w:pos="7328"/>
+          <w:tab w:val="left" w:pos="8244"/>
+          <w:tab w:val="left" w:pos="9160"/>
+          <w:tab w:val="left" w:pos="10076"/>
+          <w:tab w:val="left" w:pos="10992"/>
+          <w:tab w:val="left" w:pos="11908"/>
+          <w:tab w:val="left" w:pos="12824"/>
+          <w:tab w:val="left" w:pos="13740"/>
+          <w:tab w:val="left" w:pos="14656"/>
+        </w:tabs>
+        <w:spacing w:after="0" w:line="240" w:lineRule="auto"/>
+        <w:rPr>
+          <w:rFonts w:ascii="Courier New" w:eastAsia="Times New Roman" w:hAnsi="Courier New" w:cs="Courier New"/>
+          <w:kern w:val="0"/>
+          <w:sz w:val="20"/>
+          <w:szCs w:val="20"/>
+          <w:lang w:eastAsia="en-IN"/>
+          <w14:ligatures w14:val="none"/>
+        </w:rPr>
+      </w:pPr>
+      <w:r>
+        <w:rPr>
+          <w:rFonts w:ascii="Courier New" w:eastAsia="Times New Roman" w:hAnsi="Courier New" w:cs="Courier New"/>
+          <w:kern w:val="0"/>
+          <w:sz w:val="20"/>
+          <w:szCs w:val="20"/>
+          <w:lang w:eastAsia="en-IN"/>
+          <w14:ligatures w14:val="none"/>
+        </w:rPr>
+        <w:t xml:space="preserve">      "amount": 150,</w:t>
+      </w:r>
+    </w:p>
+    <w:p>
+      <w:pPr>
+        <w:tabs>
+          <w:tab w:val="left" w:pos="916"/>
+          <w:tab w:val="left" w:pos="1832"/>
+          <w:tab w:val="left" w:pos="2748"/>
+          <w:tab w:val="left" w:pos="3664"/>
+          <w:tab w:val="left" w:pos="4580"/>
+          <w:tab w:val="left" w:pos="5496"/>
+          <w:tab w:val="left" w:pos="6412"/>
+          <w:tab w:val="left" w:pos="7328"/>
+          <w:tab w:val="left" w:pos="8244"/>
+          <w:tab w:val="left" w:pos="9160"/>
+          <w:tab w:val="left" w:pos="10076"/>
+          <w:tab w:val="left" w:pos="10992"/>
+          <w:tab w:val="left" w:pos="11908"/>
+          <w:tab w:val="left" w:pos="12824"/>
+          <w:tab w:val="left" w:pos="13740"/>
+          <w:tab w:val="left" w:pos="14656"/>
+        </w:tabs>
+        <w:spacing w:after="0" w:line="240" w:lineRule="auto"/>
+        <w:rPr>
+          <w:rFonts w:ascii="Courier New" w:eastAsia="Times New Roman" w:hAnsi="Courier New" w:cs="Courier New"/>
+          <w:kern w:val="0"/>
+          <w:sz w:val="20"/>
+          <w:szCs w:val="20"/>
+          <w:lang w:eastAsia="en-IN"/>
+          <w14:ligatures w14:val="none"/>
+        </w:rPr>
+      </w:pPr>
+      <w:r>
+        <w:rPr>
+          <w:rFonts w:ascii="Courier New" w:eastAsia="Times New Roman" w:hAnsi="Courier New" w:cs="Courier New"/>
+          <w:kern w:val="0"/>
+          <w:sz w:val="20"/>
+          <w:szCs w:val="20"/>
+          <w:lang w:eastAsia="en-IN"/>
+          <w14:ligatures w14:val="none"/>
+        </w:rPr>
+        <w:t xml:space="preserve">      "category": "Food",</w:t>
+      </w:r>
+    </w:p>
+    <w:p>
+      <w:pPr>
+        <w:tabs>
+          <w:tab w:val="left" w:pos="916"/>
+          <w:tab w:val="left" w:pos="1832"/>
+          <w:tab w:val="left" w:pos="2748"/>
+          <w:tab w:val="left" w:pos="3664"/>
+          <w:tab w:val="left" w:pos="4580"/>
+          <w:tab w:val="left" w:pos="5496"/>
+          <w:tab w:val="left" w:pos="6412"/>
+          <w:tab w:val="left" w:pos="7328"/>
+          <w:tab w:val="left" w:pos="8244"/>
+          <w:tab w:val="left" w:pos="9160"/>
+          <w:tab w:val="left" w:pos="10076"/>
+          <w:tab w:val="left" w:pos="10992"/>
+          <w:tab w:val="left" w:pos="11908"/>
+          <w:tab w:val="left" w:pos="12824"/>
+          <w:tab w:val="left" w:pos="13740"/>
+          <w:tab w:val="left" w:pos="14656"/>
+        </w:tabs>
+        <w:spacing w:after="0" w:line="240" w:lineRule="auto"/>
+        <w:rPr>
+          <w:rFonts w:ascii="Courier New" w:eastAsia="Times New Roman" w:hAnsi="Courier New" w:cs="Courier New"/>
+          <w:kern w:val="0"/>
+          <w:sz w:val="20"/>
+          <w:szCs w:val="20"/>
+          <w:lang w:eastAsia="en-IN"/>
+          <w14:ligatures w14:val="none"/>
+        </w:rPr>
+      </w:pPr>
+      <w:r>
+        <w:rPr>
+          <w:rFonts w:ascii="Courier New" w:eastAsia="Times New Roman" w:hAnsi="Courier New" w:cs="Courier New"/>
+          <w:kern w:val="0"/>
+          <w:sz w:val="20"/>
+          <w:szCs w:val="20"/>
+          <w:lang w:eastAsia="en-IN"/>
+          <w14:ligatures w14:val="none"/>
+        </w:rPr>
+        <w:t xml:space="preserve">      "date": "2026-02-06"</w:t>
+      </w:r>
+    </w:p>
+    <w:p>
+      <w:pPr>
+        <w:tabs>
+          <w:tab w:val="left" w:pos="916"/>
+          <w:tab w:val="left" w:pos="1832"/>
+          <w:tab w:val="left" w:pos="2748"/>
+          <w:tab w:val="left" w:pos="3664"/>
+          <w:tab w:val="left" w:pos="4580"/>
+          <w:tab w:val="left" w:pos="5496"/>
+          <w:tab w:val="left" w:pos="6412"/>
+          <w:tab w:val="left" w:pos="7328"/>
+          <w:tab w:val="left" w:pos="8244"/>
+          <w:tab w:val="left" w:pos="9160"/>
+          <w:tab w:val="left" w:pos="10076"/>
+          <w:tab w:val="left" w:pos="10992"/>
+          <w:tab w:val="left" w:pos="11908"/>
+          <w:tab w:val="left" w:pos="12824"/>
+          <w:tab w:val="left" w:pos="13740"/>
+          <w:tab w:val="left" w:pos="14656"/>
+        </w:tabs>
+        <w:spacing w:after="0" w:line="240" w:lineRule="auto"/>
+        <w:rPr>
+          <w:rFonts w:ascii="Courier New" w:eastAsia="Times New Roman" w:hAnsi="Courier New" w:cs="Courier New"/>
+          <w:kern w:val="0"/>
+          <w:sz w:val="20"/>
+          <w:szCs w:val="20"/>
+          <w:lang w:eastAsia="en-IN"/>
+          <w14:ligatures w14:val="none"/>
+        </w:rPr>
+      </w:pPr>
+      <w:r>
+        <w:rPr>
+          <w:rFonts w:ascii="Courier New" w:eastAsia="Times New Roman" w:hAnsi="Courier New" w:cs="Courier New"/>
+          <w:kern w:val="0"/>
+          <w:sz w:val="20"/>
+          <w:szCs w:val="20"/>
+          <w:lang w:eastAsia="en-IN"/>
+          <w14:ligatures w14:val="none"/>
+        </w:rPr>
+        <w:t xml:space="preserve">    }</w:t>
+      </w:r>
+    </w:p>
+    <w:p>
+      <w:pPr>
+        <w:tabs>
+          <w:tab w:val="left" w:pos="916"/>
+          <w:tab w:val="left" w:pos="1832"/>
+          <w:tab w:val="left" w:pos="2748"/>
+          <w:tab w:val="left" w:pos="3664"/>
+          <w:tab w:val="left" w:pos="4580"/>
+          <w:tab w:val="left" w:pos="5496"/>
+          <w:tab w:val="left" w:pos="6412"/>
+          <w:tab w:val="left" w:pos="7328"/>
+          <w:tab w:val="left" w:pos="8244"/>
+          <w:tab w:val="left" w:pos="9160"/>
+          <w:tab w:val="left" w:pos="10076"/>
+          <w:tab w:val="left" w:pos="10992"/>
+          <w:tab w:val="left" w:pos="11908"/>
+          <w:tab w:val="left" w:pos="12824"/>
+          <w:tab w:val="left" w:pos="13740"/>
+          <w:tab w:val="left" w:pos="14656"/>
+        </w:tabs>
+        <w:spacing w:after="0" w:line="240" w:lineRule="auto"/>
+        <w:rPr>
+          <w:rFonts w:ascii="Courier New" w:eastAsia="Times New Roman" w:hAnsi="Courier New" w:cs="Courier New"/>
+          <w:kern w:val="0"/>
+          <w:sz w:val="20"/>
+          <w:szCs w:val="20"/>
+          <w:lang w:eastAsia="en-IN"/>
+          <w14:ligatures w14:val="none"/>
+        </w:rPr>
+      </w:pPr>
+      <w:r>
+        <w:rPr>
+          <w:rFonts w:ascii="Courier New" w:eastAsia="Times New Roman" w:hAnsi="Courier New" w:cs="Courier New"/>
+          <w:kern w:val="0"/>
+          <w:sz w:val="20"/>
+          <w:szCs w:val="20"/>
+          <w:lang w:eastAsia="en-IN"/>
+          <w14:ligatures w14:val="none"/>
+        </w:rPr>
+        <w:t xml:space="preserve">  ]</w:t>
+      </w:r>
+    </w:p>
+    <w:p>
+      <w:pPr>
+        <w:tabs>
+          <w:tab w:val="left" w:pos="916"/>
+          <w:tab w:val="left" w:pos="1832"/>
+          <w:tab w:val="left" w:pos="2748"/>
+          <w:tab w:val="left" w:pos="3664"/>
+          <w:tab w:val="left" w:pos="4580"/>
+          <w:tab w:val="left" w:pos="5496"/>
+          <w:tab w:val="left" w:pos="6412"/>
+          <w:tab w:val="left" w:pos="7328"/>
+          <w:tab w:val="left" w:pos="8244"/>
+          <w:tab w:val="left" w:pos="9160"/>
+          <w:tab w:val="left" w:pos="10076"/>
+          <w:tab w:val="left" w:pos="10992"/>
+          <w:tab w:val="left" w:pos="11908"/>
+          <w:tab w:val="left" w:pos="12824"/>
+          <w:tab w:val="left" w:pos="13740"/>
+          <w:tab w:val="left" w:pos="14656"/>
+        </w:tabs>
+        <w:spacing w:after="0" w:line="240" w:lineRule="auto"/>
+        <w:rPr>
+          <w:rFonts w:ascii="Courier New" w:eastAsia="Times New Roman" w:hAnsi="Courier New" w:cs="Courier New"/>
+          <w:kern w:val="0"/>
+          <w:sz w:val="20"/>
+          <w:szCs w:val="20"/>
+          <w:lang w:eastAsia="en-IN"/>
+          <w14:ligatures w14:val="none"/>
+        </w:rPr>
+      </w:pPr>
+      <w:r>
+        <w:rPr>
+          <w:rFonts w:ascii="Courier New" w:eastAsia="Times New Roman" w:hAnsi="Courier New" w:cs="Courier New"/>
+          <w:kern w:val="0"/>
+          <w:sz w:val="20"/>
+          <w:szCs w:val="20"/>
+          <w:lang w:eastAsia="en-IN"/>
+          <w14:ligatures w14:val="none"/>
+        </w:rPr>
+        <w:t>}</w:t>
+      </w:r>
+    </w:p>
+    <w:p>
+      <w:pPr>
+        <w:tabs>
+          <w:tab w:val="left" w:pos="916"/>
+          <w:tab w:val="left" w:pos="1832"/>
+          <w:tab w:val="left" w:pos="2748"/>
+          <w:tab w:val="left" w:pos="3664"/>
+          <w:tab w:val="left" w:pos="4580"/>
+          <w:tab w:val="left" w:pos="5496"/>
+          <w:tab w:val="left" w:pos="6412"/>
+          <w:tab w:val="left" w:pos="7328"/>
+          <w:tab w:val="left" w:pos="8244"/>
+          <w:tab w:val="left" w:pos="9160"/>
+          <w:tab w:val="left" w:pos="10076"/>
+          <w:tab w:val="left" w:pos="10992"/>
+          <w:tab w:val="left" w:pos="11908"/>
+          <w:tab w:val="left" w:pos="12824"/>
+          <w:tab w:val="left" w:pos="13740"/>
+          <w:tab w:val="left" w:pos="14656"/>
+        </w:tabs>
+        <w:spacing w:after="0" w:line="240" w:lineRule="auto"/>
+        <w:rPr>
+          <w:rFonts w:ascii="Courier New" w:eastAsia="Times New Roman" w:hAnsi="Courier New" w:cs="Courier New"/>
+          <w:kern w:val="0"/>
+          <w:sz w:val="20"/>
+          <w:szCs w:val="20"/>
+          <w:lang w:eastAsia="en-IN"/>
+          <w14:ligatures w14:val="none"/>
+        </w:rPr>
+      </w:pPr>
+    </w:p>
+    <w:p>
+      <w:pPr>
+        <w:tabs>
+          <w:tab w:val="left" w:pos="916"/>
+          <w:tab w:val="left" w:pos="1832"/>
+          <w:tab w:val="left" w:pos="2748"/>
+          <w:tab w:val="left" w:pos="3664"/>
+          <w:tab w:val="left" w:pos="4580"/>
+          <w:tab w:val="left" w:pos="5496"/>
+          <w:tab w:val="left" w:pos="6412"/>
+          <w:tab w:val="left" w:pos="7328"/>
+          <w:tab w:val="left" w:pos="8244"/>
+          <w:tab w:val="left" w:pos="9160"/>
+          <w:tab w:val="left" w:pos="10076"/>
+          <w:tab w:val="left" w:pos="10992"/>
+          <w:tab w:val="left" w:pos="11908"/>
+          <w:tab w:val="left" w:pos="12824"/>
+          <w:tab w:val="left" w:pos="13740"/>
+          <w:tab w:val="left" w:pos="14656"/>
+        </w:tabs>
+        <w:spacing w:after="0" w:line="240" w:lineRule="auto"/>
+        <w:rPr>
+          <w:rFonts w:ascii="Courier New" w:eastAsia="Times New Roman" w:hAnsi="Courier New" w:cs="Courier New"/>
+          <w:kern w:val="0"/>
+          <w:sz w:val="20"/>
+          <w:szCs w:val="20"/>
+          <w:lang w:eastAsia="en-IN"/>
+          <w14:ligatures w14:val="none"/>
+        </w:rPr>
+      </w:pPr>
+      <w:r>
+        <w:rPr>
+          <w:rFonts w:ascii="Times New Roman" w:eastAsia="Times New Roman" w:hAnsi="Times New Roman" w:cs="Times New Roman"/>
+          <w:b/>
+          <w:bCs/>
+          <w:kern w:val="0"/>
+          <w:lang w:eastAsia="en-IN"/>
+          <w14:ligatures w14:val="none"/>
+        </w:rPr>
+        <w:t>DELETE /</w:t>
+      </w:r>
+      <w:proofErr w:type="spellStart"/>
+      <w:r>
+        <w:rPr>
+          <w:rFonts w:ascii="Times New Roman" w:eastAsia="Times New Roman" w:hAnsi="Times New Roman" w:cs="Times New Roman"/>
+          <w:b/>
+          <w:bCs/>
+          <w:kern w:val="0"/>
+          <w:lang w:eastAsia="en-IN"/>
+          <w14:ligatures w14:val="none"/>
+        </w:rPr>
+        <w:t>api</w:t>
+      </w:r>
+      <w:proofErr w:type="spellEnd"/>
+      <w:r>
+        <w:rPr>
+          <w:rFonts w:ascii="Times New Roman" w:eastAsia="Times New Roman" w:hAnsi="Times New Roman" w:cs="Times New Roman"/>
+          <w:b/>
+          <w:bCs/>
+          <w:kern w:val="0"/>
+          <w:lang w:eastAsia="en-IN"/>
+          <w14:ligatures w14:val="none"/>
+        </w:rPr>
+        <w:t>/expenses/:id</w:t>
+      </w:r>
+    </w:p>
+    <w:p>
+      <w:pPr>
+        <w:spacing w:before="100" w:beforeAutospacing="1" w:after="100" w:afterAutospacing="1" w:line="240" w:lineRule="auto"/>
+        <w:rPr>
+          <w:rFonts w:ascii="Times New Roman" w:eastAsia="Times New Roman" w:hAnsi="Times New Roman" w:cs="Times New Roman"/>
+          <w:kern w:val="0"/>
+          <w:lang w:eastAsia="en-IN"/>
+          <w14:ligatures w14:val="none"/>
+        </w:rPr>
+      </w:pPr>
+      <w:r>
+        <w:rPr>
+          <w:rFonts w:ascii="Times New Roman" w:eastAsia="Times New Roman" w:hAnsi="Times New Roman" w:cs="Times New Roman"/>
+          <w:b/>
+          <w:bCs/>
+          <w:kern w:val="0"/>
+          <w:lang w:eastAsia="en-IN"/>
+          <w14:ligatures w14:val="none"/>
+        </w:rPr>
+        <w:t>Description:</w:t>
+      </w:r>
+      <w:r>
+        <w:rPr>
+          <w:rFonts w:ascii="Times New Roman" w:eastAsia="Times New Roman" w:hAnsi="Times New Roman" w:cs="Times New Roman"/>
+          <w:kern w:val="0"/>
+          <w:lang w:eastAsia="en-IN"/>
+          <w14:ligatures w14:val="none"/>
+        </w:rPr>
+        <w:t xml:space="preserve"> Delete an expense by ID</w:t>
+      </w:r>
+    </w:p>
+    <w:p>
+      <w:pPr>
+        <w:spacing w:before="100" w:beforeAutospacing="1" w:after="100" w:afterAutospacing="1" w:line="240" w:lineRule="auto"/>
+        <w:rPr>
+          <w:rFonts w:ascii="Times New Roman" w:eastAsia="Times New Roman" w:hAnsi="Times New Roman" w:cs="Times New Roman"/>
+          <w:kern w:val="0"/>
+          <w:lang w:eastAsia="en-IN"/>
+          <w14:ligatures w14:val="none"/>
+        </w:rPr>
+      </w:pPr>
+      <w:r>
+        <w:rPr>
+          <w:rFonts w:ascii="Times New Roman" w:eastAsia="Times New Roman" w:hAnsi="Times New Roman" w:cs="Times New Roman"/>
+          <w:b/>
+          <w:bCs/>
+          <w:kern w:val="0"/>
+          <w:lang w:eastAsia="en-IN"/>
+          <w14:ligatures w14:val="none"/>
+        </w:rPr>
+        <w:t>Response:</w:t>
+      </w:r>
+    </w:p>
+    <w:p>
+      <w:pPr>
+        <w:tabs>
+          <w:tab w:val="left" w:pos="916"/>
+          <w:tab w:val="left" w:pos="1832"/>
+          <w:tab w:val="left" w:pos="2748"/>
+          <w:tab w:val="left" w:pos="3664"/>
+          <w:tab w:val="left" w:pos="4580"/>
+          <w:tab w:val="left" w:pos="5496"/>
+          <w:tab w:val="left" w:pos="6412"/>
+          <w:tab w:val="left" w:pos="7328"/>
+          <w:tab w:val="left" w:pos="8244"/>
+          <w:tab w:val="left" w:pos="9160"/>
+          <w:tab w:val="left" w:pos="10076"/>
+          <w:tab w:val="left" w:pos="10992"/>
+          <w:tab w:val="left" w:pos="11908"/>
+          <w:tab w:val="left" w:pos="12824"/>
+          <w:tab w:val="left" w:pos="13740"/>
+          <w:tab w:val="left" w:pos="14656"/>
+        </w:tabs>
+        <w:spacing w:after="0" w:line="240" w:lineRule="auto"/>
+        <w:rPr>
+          <w:rFonts w:ascii="Courier New" w:eastAsia="Times New Roman" w:hAnsi="Courier New" w:cs="Courier New"/>
+          <w:kern w:val="0"/>
+          <w:sz w:val="20"/>
+          <w:szCs w:val="20"/>
+          <w:lang w:eastAsia="en-IN"/>
+          <w14:ligatures w14:val="none"/>
+        </w:rPr>
+      </w:pPr>
+      <w:r>
+        <w:rPr>
+          <w:rFonts w:ascii="Courier New" w:eastAsia="Times New Roman" w:hAnsi="Courier New" w:cs="Courier New"/>
+          <w:kern w:val="0"/>
+          <w:sz w:val="20"/>
+          <w:szCs w:val="20"/>
+          <w:lang w:eastAsia="en-IN"/>
+          <w14:ligatures w14:val="none"/>
+        </w:rPr>
+        <w:t>{</w:t>
+      </w:r>
+    </w:p>
+    <w:p>
+      <w:pPr>
+        <w:tabs>
+          <w:tab w:val="left" w:pos="916"/>
+          <w:tab w:val="left" w:pos="1832"/>
+          <w:tab w:val="left" w:pos="2748"/>
+          <w:tab w:val="left" w:pos="3664"/>
+          <w:tab w:val="left" w:pos="4580"/>
+          <w:tab w:val="left" w:pos="5496"/>
+          <w:tab w:val="left" w:pos="6412"/>
+          <w:tab w:val="left" w:pos="7328"/>
+          <w:tab w:val="left" w:pos="8244"/>
+          <w:tab w:val="left" w:pos="9160"/>
+          <w:tab w:val="left" w:pos="10076"/>
+          <w:tab w:val="left" w:pos="10992"/>
+          <w:tab w:val="left" w:pos="11908"/>
+          <w:tab w:val="left" w:pos="12824"/>
+          <w:tab w:val="left" w:pos="13740"/>
+          <w:tab w:val="left" w:pos="14656"/>
+        </w:tabs>
+        <w:spacing w:after="0" w:line="240" w:lineRule="auto"/>
+        <w:rPr>
+          <w:rFonts w:ascii="Courier New" w:eastAsia="Times New Roman" w:hAnsi="Courier New" w:cs="Courier New"/>
+          <w:kern w:val="0"/>
+          <w:sz w:val="20"/>
+          <w:szCs w:val="20"/>
+          <w:lang w:eastAsia="en-IN"/>
+          <w14:ligatures w14:val="none"/>
+        </w:rPr>
+      </w:pPr>
+      <w:r>
+        <w:rPr>
+          <w:rFonts w:ascii="Courier New" w:eastAsia="Times New Roman" w:hAnsi="Courier New" w:cs="Courier New"/>
+          <w:kern w:val="0"/>
+          <w:sz w:val="20"/>
+          <w:szCs w:val="20"/>
+          <w:lang w:eastAsia="en-IN"/>
+          <w14:ligatures w14:val="none"/>
+        </w:rPr>
+        <w:t xml:space="preserve">  "success": true,</w:t>
+      </w:r>
+    </w:p>
+    <w:p>
+      <w:pPr>
+        <w:tabs>
+          <w:tab w:val="left" w:pos="916"/>
+          <w:tab w:val="left" w:pos="1832"/>
+          <w:tab w:val="left" w:pos="2748"/>
+          <w:tab w:val="left" w:pos="3664"/>
+          <w:tab w:val="left" w:pos="4580"/>
+          <w:tab w:val="left" w:pos="5496"/>
+          <w:tab w:val="left" w:pos="6412"/>
+          <w:tab w:val="left" w:pos="7328"/>
+          <w:tab w:val="left" w:pos="8244"/>
+          <w:tab w:val="left" w:pos="9160"/>
+          <w:tab w:val="left" w:pos="10076"/>
+          <w:tab w:val="left" w:pos="10992"/>
+          <w:tab w:val="left" w:pos="11908"/>
+          <w:tab w:val="left" w:pos="12824"/>
+          <w:tab w:val="left" w:pos="13740"/>
+          <w:tab w:val="left" w:pos="14656"/>
+        </w:tabs>
+        <w:spacing w:after="0" w:line="240" w:lineRule="auto"/>
+        <w:rPr>
+          <w:rFonts w:ascii="Courier New" w:eastAsia="Times New Roman" w:hAnsi="Courier New" w:cs="Courier New"/>
+          <w:kern w:val="0"/>
+          <w:sz w:val="20"/>
+          <w:szCs w:val="20"/>
+          <w:lang w:eastAsia="en-IN"/>
+          <w14:ligatures w14:val="none"/>
+        </w:rPr>
+      </w:pPr>
+      <w:r>
+        <w:rPr>
+          <w:rFonts w:ascii="Courier New" w:eastAsia="Times New Roman" w:hAnsi="Courier New" w:cs="Courier New"/>
+          <w:kern w:val="0"/>
+          <w:sz w:val="20"/>
+          <w:szCs w:val="20"/>
+          <w:lang w:eastAsia="en-IN"/>
+          <w14:ligatures w14:val="none"/>
+        </w:rPr>
+        <w:t xml:space="preserve">  "message": "Expense deleted successfully"</w:t>
+      </w:r>
+    </w:p>
+    <w:p>
+      <w:pPr>
+        <w:tabs>
+          <w:tab w:val="left" w:pos="916"/>
+          <w:tab w:val="left" w:pos="1832"/>
+          <w:tab w:val="left" w:pos="2748"/>
+          <w:tab w:val="left" w:pos="3664"/>
+          <w:tab w:val="left" w:pos="4580"/>
+          <w:tab w:val="left" w:pos="5496"/>
+          <w:tab w:val="left" w:pos="6412"/>
+          <w:tab w:val="left" w:pos="7328"/>
+          <w:tab w:val="left" w:pos="8244"/>
+          <w:tab w:val="left" w:pos="9160"/>
+          <w:tab w:val="left" w:pos="10076"/>
+          <w:tab w:val="left" w:pos="10992"/>
+          <w:tab w:val="left" w:pos="11908"/>
+          <w:tab w:val="left" w:pos="12824"/>
+          <w:tab w:val="left" w:pos="13740"/>
+          <w:tab w:val="left" w:pos="14656"/>
+        </w:tabs>
+        <w:spacing w:after="0" w:line="240" w:lineRule="auto"/>
+        <w:rPr>
+          <w:rFonts w:ascii="Courier New" w:eastAsia="Times New Roman" w:hAnsi="Courier New" w:cs="Courier New"/>
+          <w:kern w:val="0"/>
+          <w:sz w:val="20"/>
+          <w:szCs w:val="20"/>
+          <w:lang w:eastAsia="en-IN"/>
+          <w14:ligatures w14:val="none"/>
+        </w:rPr>
+      </w:pPr>
+      <w:r>
+        <w:rPr>
+          <w:rFonts w:ascii="Courier New" w:eastAsia="Times New Roman" w:hAnsi="Courier New" w:cs="Courier New"/>
+          <w:kern w:val="0"/>
+          <w:sz w:val="20"/>
+          <w:szCs w:val="20"/>
+          <w:lang w:eastAsia="en-IN"/>
+          <w14:ligatures w14:val="none"/>
+        </w:rPr>
+        <w:t>}</w:t>
+      </w:r>
+    </w:p>
+    <w:p>
+      <w:pPr>
+        <w:tabs>
+          <w:tab w:val="left" w:pos="916"/>
+          <w:tab w:val="left" w:pos="1832"/>
+          <w:tab w:val="left" w:pos="2748"/>
+          <w:tab w:val="left" w:pos="3664"/>
+          <w:tab w:val="left" w:pos="4580"/>
+          <w:tab w:val="left" w:pos="5496"/>
+          <w:tab w:val="left" w:pos="6412"/>
+          <w:tab w:val="left" w:pos="7328"/>
+          <w:tab w:val="left" w:pos="8244"/>
+          <w:tab w:val="left" w:pos="9160"/>
+          <w:tab w:val="left" w:pos="10076"/>
+          <w:tab w:val="left" w:pos="10992"/>
+          <w:tab w:val="left" w:pos="11908"/>
+          <w:tab w:val="left" w:pos="12824"/>
+          <w:tab w:val="left" w:pos="13740"/>
+          <w:tab w:val="left" w:pos="14656"/>
+        </w:tabs>
+        <w:spacing w:after="0" w:line="240" w:lineRule="auto"/>
+        <w:rPr>
+          <w:rFonts w:ascii="Courier New" w:eastAsia="Times New Roman" w:hAnsi="Courier New" w:cs="Courier New"/>
+          <w:kern w:val="0"/>
+          <w:sz w:val="20"/>
+          <w:szCs w:val="20"/>
+          <w:lang w:eastAsia="en-IN"/>
+          <w14:ligatures w14:val="none"/>
+        </w:rPr>
+      </w:pPr>
+    </w:p>
+    <w:p>
+      <w:pPr>
+        <w:tabs>
+          <w:tab w:val="left" w:pos="916"/>
+          <w:tab w:val="left" w:pos="1832"/>
+          <w:tab w:val="left" w:pos="2748"/>
+          <w:tab w:val="left" w:pos="3664"/>
+          <w:tab w:val="left" w:pos="4580"/>
+          <w:tab w:val="left" w:pos="5496"/>
+          <w:tab w:val="left" w:pos="6412"/>
+          <w:tab w:val="left" w:pos="7328"/>
+          <w:tab w:val="left" w:pos="8244"/>
+          <w:tab w:val="left" w:pos="9160"/>
+          <w:tab w:val="left" w:pos="10076"/>
+          <w:tab w:val="left" w:pos="10992"/>
+          <w:tab w:val="left" w:pos="11908"/>
+          <w:tab w:val="left" w:pos="12824"/>
+          <w:tab w:val="left" w:pos="13740"/>
+          <w:tab w:val="left" w:pos="14656"/>
+        </w:tabs>
+        <w:spacing w:after="0" w:line="240" w:lineRule="auto"/>
+        <w:rPr>
+          <w:rFonts w:ascii="Courier New" w:eastAsia="Times New Roman" w:hAnsi="Courier New" w:cs="Courier New"/>
+          <w:kern w:val="0"/>
+          <w:sz w:val="20"/>
+          <w:szCs w:val="20"/>
+          <w:lang w:eastAsia="en-IN"/>
+          <w14:ligatures w14:val="none"/>
+        </w:rPr>
+      </w:pPr>
+    </w:p>
+    <w:p>
+      <w:pPr>
+        <w:tabs>
+          <w:tab w:val="left" w:pos="916"/>
+          <w:tab w:val="left" w:pos="1832"/>
+          <w:tab w:val="left" w:pos="2748"/>
+          <w:tab w:val="left" w:pos="3664"/>
+          <w:tab w:val="left" w:pos="4580"/>
+          <w:tab w:val="left" w:pos="5496"/>
+          <w:tab w:val="left" w:pos="6412"/>
+          <w:tab w:val="left" w:pos="7328"/>
+          <w:tab w:val="left" w:pos="8244"/>
+          <w:tab w:val="left" w:pos="9160"/>
+          <w:tab w:val="left" w:pos="10076"/>
+          <w:tab w:val="left" w:pos="10992"/>
+          <w:tab w:val="left" w:pos="11908"/>
+          <w:tab w:val="left" w:pos="12824"/>
+          <w:tab w:val="left" w:pos="13740"/>
+          <w:tab w:val="left" w:pos="14656"/>
+        </w:tabs>
+        <w:spacing w:after="0" w:line="240" w:lineRule="auto"/>
+        <w:rPr>
+          <w:rFonts w:ascii="Courier New" w:eastAsia="Times New Roman" w:hAnsi="Courier New" w:cs="Courier New"/>
+          <w:kern w:val="0"/>
+          <w:sz w:val="20"/>
+          <w:szCs w:val="20"/>
+          <w:lang w:eastAsia="en-IN"/>
+          <w14:ligatures w14:val="none"/>
+        </w:rPr>
+      </w:pPr>
+    </w:p>
+    <w:p>
+      <w:pPr>
+        <w:tabs>
+          <w:tab w:val="left" w:pos="916"/>
+          <w:tab w:val="left" w:pos="1832"/>
+          <w:tab w:val="left" w:pos="2748"/>
+          <w:tab w:val="left" w:pos="3664"/>
+          <w:tab w:val="left" w:pos="4580"/>
+          <w:tab w:val="left" w:pos="5496"/>
+          <w:tab w:val="left" w:pos="6412"/>
+          <w:tab w:val="left" w:pos="7328"/>
+          <w:tab w:val="left" w:pos="8244"/>
+          <w:tab w:val="left" w:pos="9160"/>
+          <w:tab w:val="left" w:pos="10076"/>
+          <w:tab w:val="left" w:pos="10992"/>
+          <w:tab w:val="left" w:pos="11908"/>
+          <w:tab w:val="left" w:pos="12824"/>
+          <w:tab w:val="left" w:pos="13740"/>
+          <w:tab w:val="left" w:pos="14656"/>
+        </w:tabs>
+        <w:spacing w:after="0" w:line="240" w:lineRule="auto"/>
+        <w:rPr>
+          <w:rFonts w:ascii="Times New Roman" w:eastAsia="Times New Roman" w:hAnsi="Times New Roman" w:cs="Times New Roman"/>
+          <w:b/>
+          <w:bCs/>
+          <w:kern w:val="0"/>
+          <w:sz w:val="27"/>
+          <w:szCs w:val="27"/>
+          <w:lang w:eastAsia="en-IN"/>
+          <w14:ligatures w14:val="none"/>
+        </w:rPr>
+      </w:pPr>
+    </w:p>
+    <w:p>
+      <w:pPr>
+        <w:tabs>
+          <w:tab w:val="left" w:pos="916"/>
+          <w:tab w:val="left" w:pos="1832"/>
+          <w:tab w:val="left" w:pos="2748"/>
+          <w:tab w:val="left" w:pos="3664"/>
+          <w:tab w:val="left" w:pos="4580"/>
+          <w:tab w:val="left" w:pos="5496"/>
+          <w:tab w:val="left" w:pos="6412"/>
+          <w:tab w:val="left" w:pos="7328"/>
+          <w:tab w:val="left" w:pos="8244"/>
+          <w:tab w:val="left" w:pos="9160"/>
+          <w:tab w:val="left" w:pos="10076"/>
+          <w:tab w:val="left" w:pos="10992"/>
+          <w:tab w:val="left" w:pos="11908"/>
+          <w:tab w:val="left" w:pos="12824"/>
+          <w:tab w:val="left" w:pos="13740"/>
+          <w:tab w:val="left" w:pos="14656"/>
+        </w:tabs>
+        <w:spacing w:after="0" w:line="240" w:lineRule="auto"/>
+        <w:rPr>
+          <w:rFonts w:ascii="Times New Roman" w:eastAsia="Times New Roman" w:hAnsi="Times New Roman" w:cs="Times New Roman"/>
+          <w:b/>
+          <w:bCs/>
+          <w:kern w:val="0"/>
+          <w:sz w:val="27"/>
+          <w:szCs w:val="27"/>
+          <w:lang w:eastAsia="en-IN"/>
+          <w14:ligatures w14:val="none"/>
+        </w:rPr>
+      </w:pPr>
+    </w:p>
+    <w:p>
+      <w:pPr>
+        <w:tabs>
+          <w:tab w:val="left" w:pos="916"/>
+          <w:tab w:val="left" w:pos="1832"/>
+          <w:tab w:val="left" w:pos="2748"/>
+          <w:tab w:val="left" w:pos="3664"/>
+          <w:tab w:val="left" w:pos="4580"/>
+          <w:tab w:val="left" w:pos="5496"/>
+          <w:tab w:val="left" w:pos="6412"/>
+          <w:tab w:val="left" w:pos="7328"/>
+          <w:tab w:val="left" w:pos="8244"/>
+          <w:tab w:val="left" w:pos="9160"/>
+          <w:tab w:val="left" w:pos="10076"/>
+          <w:tab w:val="left" w:pos="10992"/>
+          <w:tab w:val="left" w:pos="11908"/>
+          <w:tab w:val="left" w:pos="12824"/>
+          <w:tab w:val="left" w:pos="13740"/>
+          <w:tab w:val="left" w:pos="14656"/>
+        </w:tabs>
+        <w:spacing w:after="0" w:line="240" w:lineRule="auto"/>
+        <w:rPr>
+          <w:rFonts w:ascii="Times New Roman" w:eastAsia="Times New Roman" w:hAnsi="Times New Roman" w:cs="Times New Roman"/>
+          <w:b/>
+          <w:bCs/>
+          <w:kern w:val="0"/>
+          <w:sz w:val="27"/>
+          <w:szCs w:val="27"/>
+          <w:lang w:eastAsia="en-IN"/>
+          <w14:ligatures w14:val="none"/>
+        </w:rPr>
+      </w:pPr>
+    </w:p>
+    <w:p>
+      <w:pPr>
+        <w:tabs>
+          <w:tab w:val="left" w:pos="916"/>
+          <w:tab w:val="left" w:pos="1832"/>
+          <w:tab w:val="left" w:pos="2748"/>
+          <w:tab w:val="left" w:pos="3664"/>
+          <w:tab w:val="left" w:pos="4580"/>
+          <w:tab w:val="left" w:pos="5496"/>
+          <w:tab w:val="left" w:pos="6412"/>
+          <w:tab w:val="left" w:pos="7328"/>
+          <w:tab w:val="left" w:pos="8244"/>
+          <w:tab w:val="left" w:pos="9160"/>
+          <w:tab w:val="left" w:pos="10076"/>
+          <w:tab w:val="left" w:pos="10992"/>
+          <w:tab w:val="left" w:pos="11908"/>
+          <w:tab w:val="left" w:pos="12824"/>
+          <w:tab w:val="left" w:pos="13740"/>
+          <w:tab w:val="left" w:pos="14656"/>
+        </w:tabs>
+        <w:spacing w:after="0" w:line="240" w:lineRule="auto"/>
+        <w:rPr>
+          <w:rFonts w:ascii="Times New Roman" w:eastAsia="Times New Roman" w:hAnsi="Times New Roman" w:cs="Times New Roman"/>
+          <w:b/>
+          <w:bCs/>
+          <w:kern w:val="0"/>
+          <w:sz w:val="27"/>
+          <w:szCs w:val="27"/>
+          <w:lang w:eastAsia="en-IN"/>
+          <w14:ligatures w14:val="none"/>
+        </w:rPr>
+      </w:pPr>
+    </w:p>
+    <w:p>
+      <w:pPr>
+        <w:tabs>
+          <w:tab w:val="left" w:pos="916"/>
+          <w:tab w:val="left" w:pos="1832"/>
+          <w:tab w:val="left" w:pos="2748"/>
+          <w:tab w:val="left" w:pos="3664"/>
+          <w:tab w:val="left" w:pos="4580"/>
+          <w:tab w:val="left" w:pos="5496"/>
+          <w:tab w:val="left" w:pos="6412"/>
+          <w:tab w:val="left" w:pos="7328"/>
+          <w:tab w:val="left" w:pos="8244"/>
+          <w:tab w:val="left" w:pos="9160"/>
+          <w:tab w:val="left" w:pos="10076"/>
+          <w:tab w:val="left" w:pos="10992"/>
+          <w:tab w:val="left" w:pos="11908"/>
+          <w:tab w:val="left" w:pos="12824"/>
+          <w:tab w:val="left" w:pos="13740"/>
+          <w:tab w:val="left" w:pos="14656"/>
+        </w:tabs>
+        <w:spacing w:after="0" w:line="240" w:lineRule="auto"/>
+        <w:rPr>
+          <w:rFonts w:ascii="Courier New" w:eastAsia="Times New Roman" w:hAnsi="Courier New" w:cs="Courier New"/>
+          <w:kern w:val="0"/>
+          <w:sz w:val="20"/>
+          <w:szCs w:val="20"/>
+          <w:lang w:eastAsia="en-IN"/>
+          <w14:ligatures w14:val="none"/>
+        </w:rPr>
+      </w:pPr>
+      <w:r>
+        <w:rPr>
+          <w:rFonts w:ascii="Times New Roman" w:eastAsia="Times New Roman" w:hAnsi="Times New Roman" w:cs="Times New Roman"/>
+          <w:b/>
+          <w:bCs/>
+          <w:kern w:val="0"/>
+          <w:sz w:val="27"/>
+          <w:szCs w:val="27"/>
+          <w:lang w:eastAsia="en-IN"/>
+          <w14:ligatures w14:val="none"/>
+        </w:rPr>
+        <w:lastRenderedPageBreak/>
+        <w:t>13. Data Model</w:t>
+      </w:r>
+    </w:p>
+    <w:p>
+      <w:pPr>
+        <w:spacing w:before="100" w:beforeAutospacing="1" w:after="100" w:afterAutospacing="1" w:line="240" w:lineRule="auto"/>
+        <w:rPr>
+          <w:rFonts w:ascii="Times New Roman" w:eastAsia="Times New Roman" w:hAnsi="Times New Roman" w:cs="Times New Roman"/>
+          <w:kern w:val="0"/>
+          <w:lang w:eastAsia="en-IN"/>
+          <w14:ligatures w14:val="none"/>
+        </w:rPr>
+      </w:pPr>
+      <w:r>
+        <w:rPr>
+          <w:rFonts w:ascii="Times New Roman" w:eastAsia="Times New Roman" w:hAnsi="Times New Roman" w:cs="Times New Roman"/>
+          <w:b/>
+          <w:bCs/>
+          <w:kern w:val="0"/>
+          <w:lang w:eastAsia="en-IN"/>
+          <w14:ligatures w14:val="none"/>
+        </w:rPr>
+        <w:t>Expense Entity</w:t>
+      </w:r>
+    </w:p>
+    <w:tbl>
+      <w:tblPr>
+        <w:tblW w:w="0" w:type="auto"/>
+        <w:tblCellSpacing w:w="15" w:type="dxa"/>
+        <w:tblCellMar>
+          <w:top w:w="15" w:type="dxa"/>
+          <w:left w:w="15" w:type="dxa"/>
+          <w:bottom w:w="15" w:type="dxa"/>
+          <w:right w:w="15" w:type="dxa"/>
+        </w:tblCellMar>
+        <w:tblLook w:val="04A0" w:firstRow="1" w:lastRow="0" w:firstColumn="1" w:lastColumn="0" w:noHBand="0" w:noVBand="1"/>
+      </w:tblPr>
+      <w:tblGrid>
+        <w:gridCol w:w="1255"/>
+        <w:gridCol w:w="847"/>
+        <w:gridCol w:w="2880"/>
+      </w:tblGrid>
+      <w:tr>
+        <w:trPr>
+          <w:tblHeader/>
+          <w:tblCellSpacing w:w="15" w:type="dxa"/>
+        </w:trPr>
+        <w:tc>
+          <w:tcPr>
+            <w:tcW w:w="0" w:type="auto"/>
+            <w:vAlign w:val="center"/>
+            <w:hideMark/>
+          </w:tcPr>
+          <w:p>
+            <w:pPr>
+              <w:spacing w:after="0" w:line="240" w:lineRule="auto"/>
+              <w:jc w:val="center"/>
+              <w:rPr>
+                <w:rFonts w:ascii="Times New Roman" w:eastAsia="Times New Roman" w:hAnsi="Times New Roman" w:cs="Times New Roman"/>
+                <w:b/>
+                <w:bCs/>
+                <w:kern w:val="0"/>
+                <w:lang w:eastAsia="en-IN"/>
+                <w14:ligatures w14:val="none"/>
+              </w:rPr>
+            </w:pPr>
+            <w:r>
+              <w:rPr>
+                <w:rFonts w:ascii="Times New Roman" w:eastAsia="Times New Roman" w:hAnsi="Times New Roman" w:cs="Times New Roman"/>
+                <w:b/>
+                <w:bCs/>
+                <w:kern w:val="0"/>
+                <w:lang w:eastAsia="en-IN"/>
+                <w14:ligatures w14:val="none"/>
+              </w:rPr>
+              <w:t>Field Name</w:t>
+            </w:r>
+          </w:p>
+        </w:tc>
+        <w:tc>
+          <w:tcPr>
+            <w:tcW w:w="0" w:type="auto"/>
+            <w:vAlign w:val="center"/>
+            <w:hideMark/>
+          </w:tcPr>
+          <w:p>
+            <w:pPr>
+              <w:spacing w:after="0" w:line="240" w:lineRule="auto"/>
+              <w:jc w:val="center"/>
+              <w:rPr>
+                <w:rFonts w:ascii="Times New Roman" w:eastAsia="Times New Roman" w:hAnsi="Times New Roman" w:cs="Times New Roman"/>
+                <w:b/>
+                <w:bCs/>
+                <w:kern w:val="0"/>
+                <w:lang w:eastAsia="en-IN"/>
+                <w14:ligatures w14:val="none"/>
+              </w:rPr>
+            </w:pPr>
+            <w:r>
+              <w:rPr>
+                <w:rFonts w:ascii="Times New Roman" w:eastAsia="Times New Roman" w:hAnsi="Times New Roman" w:cs="Times New Roman"/>
+                <w:b/>
+                <w:bCs/>
+                <w:kern w:val="0"/>
+                <w:lang w:eastAsia="en-IN"/>
+                <w14:ligatures w14:val="none"/>
+              </w:rPr>
+              <w:t>Type</w:t>
+            </w:r>
+          </w:p>
+        </w:tc>
+        <w:tc>
+          <w:tcPr>
+            <w:tcW w:w="0" w:type="auto"/>
+            <w:vAlign w:val="center"/>
+            <w:hideMark/>
+          </w:tcPr>
+          <w:p>
+            <w:pPr>
+              <w:spacing w:after="0" w:line="240" w:lineRule="auto"/>
+              <w:jc w:val="center"/>
+              <w:rPr>
+                <w:rFonts w:ascii="Times New Roman" w:eastAsia="Times New Roman" w:hAnsi="Times New Roman" w:cs="Times New Roman"/>
+                <w:b/>
+                <w:bCs/>
+                <w:kern w:val="0"/>
+                <w:lang w:eastAsia="en-IN"/>
+                <w14:ligatures w14:val="none"/>
+              </w:rPr>
+            </w:pPr>
+            <w:r>
+              <w:rPr>
+                <w:rFonts w:ascii="Times New Roman" w:eastAsia="Times New Roman" w:hAnsi="Times New Roman" w:cs="Times New Roman"/>
+                <w:b/>
+                <w:bCs/>
+                <w:kern w:val="0"/>
+                <w:lang w:eastAsia="en-IN"/>
+                <w14:ligatures w14:val="none"/>
+              </w:rPr>
+              <w:t>Description</w:t>
+            </w:r>
+          </w:p>
+        </w:tc>
+      </w:tr>
+      <w:tr>
+        <w:trPr>
+          <w:tblCellSpacing w:w="15" w:type="dxa"/>
+        </w:trPr>
+        <w:tc>
+          <w:tcPr>
+            <w:tcW w:w="0" w:type="auto"/>
+            <w:vAlign w:val="center"/>
+            <w:hideMark/>
+          </w:tcPr>
+          <w:p>
+            <w:pPr>
+              <w:spacing w:after="0" w:line="240" w:lineRule="auto"/>
+              <w:rPr>
+                <w:rFonts w:ascii="Times New Roman" w:eastAsia="Times New Roman" w:hAnsi="Times New Roman" w:cs="Times New Roman"/>
+                <w:kern w:val="0"/>
+                <w:lang w:eastAsia="en-IN"/>
+                <w14:ligatures w14:val="none"/>
+              </w:rPr>
+            </w:pPr>
+            <w:r>
+              <w:rPr>
+                <w:rFonts w:ascii="Times New Roman" w:eastAsia="Times New Roman" w:hAnsi="Times New Roman" w:cs="Times New Roman"/>
+                <w:kern w:val="0"/>
+                <w:lang w:eastAsia="en-IN"/>
+                <w14:ligatures w14:val="none"/>
+              </w:rPr>
+              <w:t>id</w:t>
+            </w:r>
+          </w:p>
+        </w:tc>
+        <w:tc>
+          <w:tcPr>
+            <w:tcW w:w="0" w:type="auto"/>
+            <w:vAlign w:val="center"/>
+            <w:hideMark/>
+          </w:tcPr>
+          <w:p>
+            <w:pPr>
+              <w:spacing w:after="0" w:line="240" w:lineRule="auto"/>
+              <w:rPr>
+                <w:rFonts w:ascii="Times New Roman" w:eastAsia="Times New Roman" w:hAnsi="Times New Roman" w:cs="Times New Roman"/>
+                <w:kern w:val="0"/>
+                <w:lang w:eastAsia="en-IN"/>
+                <w14:ligatures w14:val="none"/>
+              </w:rPr>
+            </w:pPr>
+            <w:r>
+              <w:rPr>
+                <w:rFonts w:ascii="Times New Roman" w:eastAsia="Times New Roman" w:hAnsi="Times New Roman" w:cs="Times New Roman"/>
+                <w:kern w:val="0"/>
+                <w:lang w:eastAsia="en-IN"/>
+                <w14:ligatures w14:val="none"/>
+              </w:rPr>
+              <w:t>String</w:t>
+            </w:r>
+          </w:p>
+        </w:tc>
+        <w:tc>
+          <w:tcPr>
+            <w:tcW w:w="0" w:type="auto"/>
+            <w:vAlign w:val="center"/>
+            <w:hideMark/>
+          </w:tcPr>
+          <w:p>
+            <w:pPr>
+              <w:spacing w:after="0" w:line="240" w:lineRule="auto"/>
+              <w:rPr>
+                <w:rFonts w:ascii="Times New Roman" w:eastAsia="Times New Roman" w:hAnsi="Times New Roman" w:cs="Times New Roman"/>
+                <w:kern w:val="0"/>
+                <w:lang w:eastAsia="en-IN"/>
+                <w14:ligatures w14:val="none"/>
+              </w:rPr>
+            </w:pPr>
+            <w:r>
+              <w:rPr>
+                <w:rFonts w:ascii="Times New Roman" w:eastAsia="Times New Roman" w:hAnsi="Times New Roman" w:cs="Times New Roman"/>
+                <w:kern w:val="0"/>
+                <w:lang w:eastAsia="en-IN"/>
+                <w14:ligatures w14:val="none"/>
+              </w:rPr>
+              <w:t>Unique identifier</w:t>
+            </w:r>
+          </w:p>
+        </w:tc>
+      </w:tr>
+      <w:tr>
+        <w:trPr>
+          <w:tblCellSpacing w:w="15" w:type="dxa"/>
+        </w:trPr>
+        <w:tc>
+          <w:tcPr>
+            <w:tcW w:w="0" w:type="auto"/>
+            <w:vAlign w:val="center"/>
+            <w:hideMark/>
+          </w:tcPr>
+          <w:p>
+            <w:pPr>
+              <w:spacing w:after="0" w:line="240" w:lineRule="auto"/>
+              <w:rPr>
+                <w:rFonts w:ascii="Times New Roman" w:eastAsia="Times New Roman" w:hAnsi="Times New Roman" w:cs="Times New Roman"/>
+                <w:kern w:val="0"/>
+                <w:lang w:eastAsia="en-IN"/>
+                <w14:ligatures w14:val="none"/>
+              </w:rPr>
+            </w:pPr>
+            <w:r>
+              <w:rPr>
+                <w:rFonts w:ascii="Times New Roman" w:eastAsia="Times New Roman" w:hAnsi="Times New Roman" w:cs="Times New Roman"/>
+                <w:kern w:val="0"/>
+                <w:lang w:eastAsia="en-IN"/>
+                <w14:ligatures w14:val="none"/>
+              </w:rPr>
+              <w:t>title</w:t>
+            </w:r>
+          </w:p>
+        </w:tc>
+        <w:tc>
+          <w:tcPr>
+            <w:tcW w:w="0" w:type="auto"/>
+            <w:vAlign w:val="center"/>
+            <w:hideMark/>
+          </w:tcPr>
+          <w:p>
+            <w:pPr>
+              <w:spacing w:after="0" w:line="240" w:lineRule="auto"/>
+              <w:rPr>
+                <w:rFonts w:ascii="Times New Roman" w:eastAsia="Times New Roman" w:hAnsi="Times New Roman" w:cs="Times New Roman"/>
+                <w:kern w:val="0"/>
+                <w:lang w:eastAsia="en-IN"/>
+                <w14:ligatures w14:val="none"/>
+              </w:rPr>
+            </w:pPr>
+            <w:r>
+              <w:rPr>
+                <w:rFonts w:ascii="Times New Roman" w:eastAsia="Times New Roman" w:hAnsi="Times New Roman" w:cs="Times New Roman"/>
+                <w:kern w:val="0"/>
+                <w:lang w:eastAsia="en-IN"/>
+                <w14:ligatures w14:val="none"/>
+              </w:rPr>
+              <w:t>String</w:t>
+            </w:r>
+          </w:p>
+        </w:tc>
+        <w:tc>
+          <w:tcPr>
+            <w:tcW w:w="0" w:type="auto"/>
+            <w:vAlign w:val="center"/>
+            <w:hideMark/>
+          </w:tcPr>
+          <w:p>
+            <w:pPr>
+              <w:spacing w:after="0" w:line="240" w:lineRule="auto"/>
+              <w:rPr>
+                <w:rFonts w:ascii="Times New Roman" w:eastAsia="Times New Roman" w:hAnsi="Times New Roman" w:cs="Times New Roman"/>
+                <w:kern w:val="0"/>
+                <w:lang w:eastAsia="en-IN"/>
+                <w14:ligatures w14:val="none"/>
+              </w:rPr>
+            </w:pPr>
+            <w:r>
+              <w:rPr>
+                <w:rFonts w:ascii="Times New Roman" w:eastAsia="Times New Roman" w:hAnsi="Times New Roman" w:cs="Times New Roman"/>
+                <w:kern w:val="0"/>
+                <w:lang w:eastAsia="en-IN"/>
+                <w14:ligatures w14:val="none"/>
+              </w:rPr>
+              <w:t>Expense title</w:t>
+            </w:r>
+          </w:p>
+        </w:tc>
+      </w:tr>
+      <w:tr>
+        <w:trPr>
+          <w:tblCellSpacing w:w="15" w:type="dxa"/>
+        </w:trPr>
+        <w:tc>
+          <w:tcPr>
+            <w:tcW w:w="0" w:type="auto"/>
+            <w:vAlign w:val="center"/>
+            <w:hideMark/>
+          </w:tcPr>
+          <w:p>
+            <w:pPr>
+              <w:spacing w:after="0" w:line="240" w:lineRule="auto"/>
+              <w:rPr>
+                <w:rFonts w:ascii="Times New Roman" w:eastAsia="Times New Roman" w:hAnsi="Times New Roman" w:cs="Times New Roman"/>
+                <w:kern w:val="0"/>
+                <w:lang w:eastAsia="en-IN"/>
+                <w14:ligatures w14:val="none"/>
+              </w:rPr>
+            </w:pPr>
+            <w:r>
+              <w:rPr>
+                <w:rFonts w:ascii="Times New Roman" w:eastAsia="Times New Roman" w:hAnsi="Times New Roman" w:cs="Times New Roman"/>
+                <w:kern w:val="0"/>
+                <w:lang w:eastAsia="en-IN"/>
+                <w14:ligatures w14:val="none"/>
+              </w:rPr>
+              <w:t>amount</w:t>
+            </w:r>
+          </w:p>
+        </w:tc>
+        <w:tc>
+          <w:tcPr>
+            <w:tcW w:w="0" w:type="auto"/>
+            <w:vAlign w:val="center"/>
+            <w:hideMark/>
+          </w:tcPr>
+          <w:p>
+            <w:pPr>
+              <w:spacing w:after="0" w:line="240" w:lineRule="auto"/>
+              <w:rPr>
+                <w:rFonts w:ascii="Times New Roman" w:eastAsia="Times New Roman" w:hAnsi="Times New Roman" w:cs="Times New Roman"/>
+                <w:kern w:val="0"/>
+                <w:lang w:eastAsia="en-IN"/>
+                <w14:ligatures w14:val="none"/>
+              </w:rPr>
+            </w:pPr>
+            <w:r>
+              <w:rPr>
+                <w:rFonts w:ascii="Times New Roman" w:eastAsia="Times New Roman" w:hAnsi="Times New Roman" w:cs="Times New Roman"/>
+                <w:kern w:val="0"/>
+                <w:lang w:eastAsia="en-IN"/>
+                <w14:ligatures w14:val="none"/>
+              </w:rPr>
+              <w:t>Number</w:t>
+            </w:r>
+          </w:p>
+        </w:tc>
+        <w:tc>
+          <w:tcPr>
+            <w:tcW w:w="0" w:type="auto"/>
+            <w:vAlign w:val="center"/>
+            <w:hideMark/>
+          </w:tcPr>
+          <w:p>
+            <w:pPr>
+              <w:spacing w:after="0" w:line="240" w:lineRule="auto"/>
+              <w:rPr>
+                <w:rFonts w:ascii="Times New Roman" w:eastAsia="Times New Roman" w:hAnsi="Times New Roman" w:cs="Times New Roman"/>
+                <w:kern w:val="0"/>
+                <w:lang w:eastAsia="en-IN"/>
+                <w14:ligatures w14:val="none"/>
+              </w:rPr>
+            </w:pPr>
+            <w:r>
+              <w:rPr>
+                <w:rFonts w:ascii="Times New Roman" w:eastAsia="Times New Roman" w:hAnsi="Times New Roman" w:cs="Times New Roman"/>
+                <w:kern w:val="0"/>
+                <w:lang w:eastAsia="en-IN"/>
+                <w14:ligatures w14:val="none"/>
+              </w:rPr>
+              <w:t>Expense amount</w:t>
+            </w:r>
+          </w:p>
+        </w:tc>
+      </w:tr>
+      <w:tr>
+        <w:trPr>
+          <w:tblCellSpacing w:w="15" w:type="dxa"/>
+        </w:trPr>
+        <w:tc>
+          <w:tcPr>
+            <w:tcW w:w="0" w:type="auto"/>
+            <w:vAlign w:val="center"/>
+            <w:hideMark/>
+          </w:tcPr>
+          <w:p>
+            <w:pPr>
+              <w:spacing w:after="0" w:line="240" w:lineRule="auto"/>
+              <w:rPr>
+                <w:rFonts w:ascii="Times New Roman" w:eastAsia="Times New Roman" w:hAnsi="Times New Roman" w:cs="Times New Roman"/>
+                <w:kern w:val="0"/>
+                <w:lang w:eastAsia="en-IN"/>
+                <w14:ligatures w14:val="none"/>
+              </w:rPr>
+            </w:pPr>
+            <w:r>
+              <w:rPr>
+                <w:rFonts w:ascii="Times New Roman" w:eastAsia="Times New Roman" w:hAnsi="Times New Roman" w:cs="Times New Roman"/>
+                <w:kern w:val="0"/>
+                <w:lang w:eastAsia="en-IN"/>
+                <w14:ligatures w14:val="none"/>
+              </w:rPr>
+              <w:t>category</w:t>
+            </w:r>
+          </w:p>
+        </w:tc>
+        <w:tc>
+          <w:tcPr>
+            <w:tcW w:w="0" w:type="auto"/>
+            <w:vAlign w:val="center"/>
+            <w:hideMark/>
+          </w:tcPr>
+          <w:p>
+            <w:pPr>
+              <w:spacing w:after="0" w:line="240" w:lineRule="auto"/>
+              <w:rPr>
+                <w:rFonts w:ascii="Times New Roman" w:eastAsia="Times New Roman" w:hAnsi="Times New Roman" w:cs="Times New Roman"/>
+                <w:kern w:val="0"/>
+                <w:lang w:eastAsia="en-IN"/>
+                <w14:ligatures w14:val="none"/>
+              </w:rPr>
+            </w:pPr>
+            <w:r>
+              <w:rPr>
+                <w:rFonts w:ascii="Times New Roman" w:eastAsia="Times New Roman" w:hAnsi="Times New Roman" w:cs="Times New Roman"/>
+                <w:kern w:val="0"/>
+                <w:lang w:eastAsia="en-IN"/>
+                <w14:ligatures w14:val="none"/>
+              </w:rPr>
+              <w:t>String</w:t>
+            </w:r>
+          </w:p>
+        </w:tc>
+        <w:tc>
+          <w:tcPr>
+            <w:tcW w:w="0" w:type="auto"/>
+            <w:vAlign w:val="center"/>
+            <w:hideMark/>
+          </w:tcPr>
+          <w:p>
+            <w:pPr>
+              <w:spacing w:after="0" w:line="240" w:lineRule="auto"/>
+              <w:rPr>
+                <w:rFonts w:ascii="Times New Roman" w:eastAsia="Times New Roman" w:hAnsi="Times New Roman" w:cs="Times New Roman"/>
+                <w:kern w:val="0"/>
+                <w:lang w:eastAsia="en-IN"/>
+                <w14:ligatures w14:val="none"/>
+              </w:rPr>
+            </w:pPr>
+            <w:r>
+              <w:rPr>
+                <w:rFonts w:ascii="Times New Roman" w:eastAsia="Times New Roman" w:hAnsi="Times New Roman" w:cs="Times New Roman"/>
+                <w:kern w:val="0"/>
+                <w:lang w:eastAsia="en-IN"/>
+                <w14:ligatures w14:val="none"/>
+              </w:rPr>
+              <w:t>Expense category</w:t>
+            </w:r>
+          </w:p>
+        </w:tc>
+      </w:tr>
+      <w:tr>
+        <w:trPr>
+          <w:tblCellSpacing w:w="15" w:type="dxa"/>
+        </w:trPr>
+        <w:tc>
+          <w:tcPr>
+            <w:tcW w:w="0" w:type="auto"/>
+            <w:vAlign w:val="center"/>
+            <w:hideMark/>
+          </w:tcPr>
+          <w:p>
+            <w:pPr>
+              <w:spacing w:after="0" w:line="240" w:lineRule="auto"/>
+              <w:rPr>
+                <w:rFonts w:ascii="Times New Roman" w:eastAsia="Times New Roman" w:hAnsi="Times New Roman" w:cs="Times New Roman"/>
+                <w:kern w:val="0"/>
+                <w:lang w:eastAsia="en-IN"/>
+                <w14:ligatures w14:val="none"/>
+              </w:rPr>
+            </w:pPr>
+            <w:r>
+              <w:rPr>
+                <w:rFonts w:ascii="Times New Roman" w:eastAsia="Times New Roman" w:hAnsi="Times New Roman" w:cs="Times New Roman"/>
+                <w:kern w:val="0"/>
+                <w:lang w:eastAsia="en-IN"/>
+                <w14:ligatures w14:val="none"/>
+              </w:rPr>
+              <w:t>date</w:t>
+            </w:r>
+          </w:p>
+        </w:tc>
+        <w:tc>
+          <w:tcPr>
+            <w:tcW w:w="0" w:type="auto"/>
+            <w:vAlign w:val="center"/>
+            <w:hideMark/>
+          </w:tcPr>
+          <w:p>
+            <w:pPr>
+              <w:spacing w:after="0" w:line="240" w:lineRule="auto"/>
+              <w:rPr>
+                <w:rFonts w:ascii="Times New Roman" w:eastAsia="Times New Roman" w:hAnsi="Times New Roman" w:cs="Times New Roman"/>
+                <w:kern w:val="0"/>
+                <w:lang w:eastAsia="en-IN"/>
+                <w14:ligatures w14:val="none"/>
+              </w:rPr>
+            </w:pPr>
+            <w:r>
+              <w:rPr>
+                <w:rFonts w:ascii="Times New Roman" w:eastAsia="Times New Roman" w:hAnsi="Times New Roman" w:cs="Times New Roman"/>
+                <w:kern w:val="0"/>
+                <w:lang w:eastAsia="en-IN"/>
+                <w14:ligatures w14:val="none"/>
+              </w:rPr>
+              <w:t>Date</w:t>
+            </w:r>
+          </w:p>
+        </w:tc>
+        <w:tc>
+          <w:tcPr>
+            <w:tcW w:w="0" w:type="auto"/>
+            <w:vAlign w:val="center"/>
+            <w:hideMark/>
+          </w:tcPr>
+          <w:p>
+            <w:pPr>
+              <w:spacing w:after="0" w:line="240" w:lineRule="auto"/>
+              <w:rPr>
+                <w:rFonts w:ascii="Times New Roman" w:eastAsia="Times New Roman" w:hAnsi="Times New Roman" w:cs="Times New Roman"/>
+                <w:kern w:val="0"/>
+                <w:lang w:eastAsia="en-IN"/>
+                <w14:ligatures w14:val="none"/>
+              </w:rPr>
+            </w:pPr>
+            <w:r>
+              <w:rPr>
+                <w:rFonts w:ascii="Times New Roman" w:eastAsia="Times New Roman" w:hAnsi="Times New Roman" w:cs="Times New Roman"/>
+                <w:kern w:val="0"/>
+                <w:lang w:eastAsia="en-IN"/>
+                <w14:ligatures w14:val="none"/>
+              </w:rPr>
+              <w:t>Expense date</w:t>
+            </w:r>
+          </w:p>
+        </w:tc>
+      </w:tr>
+      <w:tr>
+        <w:trPr>
+          <w:tblCellSpacing w:w="15" w:type="dxa"/>
+        </w:trPr>
+        <w:tc>
+          <w:tcPr>
+            <w:tcW w:w="0" w:type="auto"/>
+            <w:vAlign w:val="center"/>
+            <w:hideMark/>
+          </w:tcPr>
+          <w:p>
+            <w:pPr>
+              <w:spacing w:after="0" w:line="240" w:lineRule="auto"/>
+              <w:rPr>
+                <w:rFonts w:ascii="Times New Roman" w:eastAsia="Times New Roman" w:hAnsi="Times New Roman" w:cs="Times New Roman"/>
+                <w:kern w:val="0"/>
+                <w:lang w:eastAsia="en-IN"/>
+                <w14:ligatures w14:val="none"/>
+              </w:rPr>
+            </w:pPr>
+            <w:proofErr w:type="spellStart"/>
+            <w:r>
+              <w:rPr>
+                <w:rFonts w:ascii="Times New Roman" w:eastAsia="Times New Roman" w:hAnsi="Times New Roman" w:cs="Times New Roman"/>
+                <w:kern w:val="0"/>
+                <w:lang w:eastAsia="en-IN"/>
+                <w14:ligatures w14:val="none"/>
+              </w:rPr>
+              <w:t>userId</w:t>
+            </w:r>
+            <w:proofErr w:type="spellEnd"/>
+          </w:p>
+        </w:tc>
+        <w:tc>
+          <w:tcPr>
+            <w:tcW w:w="0" w:type="auto"/>
+            <w:vAlign w:val="center"/>
+            <w:hideMark/>
+          </w:tcPr>
+          <w:p>
+            <w:pPr>
+              <w:spacing w:after="0" w:line="240" w:lineRule="auto"/>
+              <w:rPr>
+                <w:rFonts w:ascii="Times New Roman" w:eastAsia="Times New Roman" w:hAnsi="Times New Roman" w:cs="Times New Roman"/>
+                <w:kern w:val="0"/>
+                <w:lang w:eastAsia="en-IN"/>
+                <w14:ligatures w14:val="none"/>
+              </w:rPr>
+            </w:pPr>
+            <w:r>
+              <w:rPr>
+                <w:rFonts w:ascii="Times New Roman" w:eastAsia="Times New Roman" w:hAnsi="Times New Roman" w:cs="Times New Roman"/>
+                <w:kern w:val="0"/>
+                <w:lang w:eastAsia="en-IN"/>
+                <w14:ligatures w14:val="none"/>
+              </w:rPr>
+              <w:t>String</w:t>
+            </w:r>
+          </w:p>
+        </w:tc>
+        <w:tc>
+          <w:tcPr>
+            <w:tcW w:w="0" w:type="auto"/>
+            <w:vAlign w:val="center"/>
+            <w:hideMark/>
+          </w:tcPr>
+          <w:p>
+            <w:pPr>
+              <w:spacing w:after="0" w:line="240" w:lineRule="auto"/>
+              <w:rPr>
+                <w:rFonts w:ascii="Times New Roman" w:eastAsia="Times New Roman" w:hAnsi="Times New Roman" w:cs="Times New Roman"/>
+                <w:kern w:val="0"/>
+                <w:lang w:eastAsia="en-IN"/>
+                <w14:ligatures w14:val="none"/>
+              </w:rPr>
+            </w:pPr>
+            <w:r>
+              <w:rPr>
+                <w:rFonts w:ascii="Times New Roman" w:eastAsia="Times New Roman" w:hAnsi="Times New Roman" w:cs="Times New Roman"/>
+                <w:kern w:val="0"/>
+                <w:lang w:eastAsia="en-IN"/>
+                <w14:ligatures w14:val="none"/>
+              </w:rPr>
+              <w:t>User reference (future phase)</w:t>
+            </w:r>
+          </w:p>
+        </w:tc>
+      </w:tr>
+    </w:tbl>
+    <w:p>
+      <w:pPr>
+        <w:tabs>
+          <w:tab w:val="left" w:pos="916"/>
+          <w:tab w:val="left" w:pos="1832"/>
+          <w:tab w:val="left" w:pos="2748"/>
+          <w:tab w:val="left" w:pos="3664"/>
+          <w:tab w:val="left" w:pos="4580"/>
+          <w:tab w:val="left" w:pos="5496"/>
+          <w:tab w:val="left" w:pos="6412"/>
+          <w:tab w:val="left" w:pos="7328"/>
+          <w:tab w:val="left" w:pos="8244"/>
+          <w:tab w:val="left" w:pos="9160"/>
+          <w:tab w:val="left" w:pos="10076"/>
+          <w:tab w:val="left" w:pos="10992"/>
+          <w:tab w:val="left" w:pos="11908"/>
+          <w:tab w:val="left" w:pos="12824"/>
+          <w:tab w:val="left" w:pos="13740"/>
+          <w:tab w:val="left" w:pos="14656"/>
+        </w:tabs>
+        <w:spacing w:after="0" w:line="240" w:lineRule="auto"/>
+        <w:rPr>
+          <w:rFonts w:ascii="Courier New" w:eastAsia="Times New Roman" w:hAnsi="Courier New" w:cs="Courier New"/>
+          <w:kern w:val="0"/>
+          <w:sz w:val="20"/>
+          <w:szCs w:val="20"/>
+          <w:lang w:eastAsia="en-IN"/>
+          <w14:ligatures w14:val="none"/>
+        </w:rPr>
+      </w:pPr>
+    </w:p>
+    <w:p>
+      <w:pPr>
+        <w:spacing w:after="0" w:line="240" w:lineRule="auto"/>
+        <w:rPr>
+          <w:rFonts w:ascii="Times New Roman" w:eastAsia="Times New Roman" w:hAnsi="Times New Roman" w:cs="Times New Roman"/>
+          <w:b/>
+          <w:bCs/>
+          <w:kern w:val="0"/>
           <w:sz w:val="28"/>
           <w:szCs w:val="28"/>
           <w:lang w:eastAsia="en-IN"/>
           <w14:ligatures w14:val="none"/>
         </w:rPr>
-        <w:t>11. Conclusion</w:t>
+      </w:pPr>
+    </w:p>
+    <w:p>
+      <w:pPr>
+        <w:spacing w:after="0" w:line="240" w:lineRule="auto"/>
+        <w:rPr>
+          <w:rFonts w:ascii="Times New Roman" w:eastAsia="Times New Roman" w:hAnsi="Times New Roman" w:cs="Times New Roman"/>
+          <w:kern w:val="0"/>
+          <w:sz w:val="20"/>
+          <w:szCs w:val="20"/>
+          <w:lang w:eastAsia="en-IN"/>
+          <w14:ligatures w14:val="none"/>
+        </w:rPr>
+      </w:pPr>
+      <w:r>
+        <w:rPr>
+          <w:rFonts w:ascii="Times New Roman" w:eastAsia="Times New Roman" w:hAnsi="Times New Roman" w:cs="Times New Roman"/>
+          <w:b/>
+          <w:bCs/>
+          <w:kern w:val="0"/>
+          <w:sz w:val="28"/>
+          <w:szCs w:val="28"/>
+          <w:lang w:eastAsia="en-IN"/>
+          <w14:ligatures w14:val="none"/>
+        </w:rPr>
+        <w:t>1</w:t>
+      </w:r>
+      <w:r>
+        <w:rPr>
+          <w:rFonts w:ascii="Times New Roman" w:eastAsia="Times New Roman" w:hAnsi="Times New Roman" w:cs="Times New Roman"/>
+          <w:b/>
+          <w:bCs/>
+          <w:kern w:val="0"/>
+          <w:sz w:val="28"/>
+          <w:szCs w:val="28"/>
+          <w:lang w:eastAsia="en-IN"/>
+          <w14:ligatures w14:val="none"/>
+        </w:rPr>
+        <w:t>4</w:t>
+      </w:r>
+      <w:r>
+        <w:rPr>
+          <w:rFonts w:ascii="Times New Roman" w:eastAsia="Times New Roman" w:hAnsi="Times New Roman" w:cs="Times New Roman"/>
+          <w:b/>
+          <w:bCs/>
+          <w:kern w:val="0"/>
+          <w:sz w:val="28"/>
+          <w:szCs w:val="28"/>
+          <w:lang w:eastAsia="en-IN"/>
+          <w14:ligatures w14:val="none"/>
+        </w:rPr>
+        <w:t>. Conclusion</w:t>
       </w:r>
     </w:p>
     <w:p>
@@ -2533,6 +5309,15 @@
           <w14:ligatures w14:val="none"/>
         </w:rPr>
         <w:t>This project follows an industry-style development approach, starting with requirement analysis and progressing through backend development, frontend integration, security implementation, analytics, and AI integration. The Expense Tracker serves as a strong demonstration of full-stack development skills suitable for placement preparation and real-world applications.</w:t>
+      </w:r>
+      <w:r>
+        <w:rPr>
+          <w:rFonts w:ascii="Times New Roman" w:eastAsia="Times New Roman" w:hAnsi="Times New Roman" w:cs="Times New Roman"/>
+          <w:kern w:val="0"/>
+          <w:lang w:eastAsia="en-IN"/>
+          <w14:ligatures w14:val="none"/>
+        </w:rPr>
+        <w:br/>
       </w:r>
     </w:p>
     <w:p>
@@ -2572,6 +5357,56 @@
     </w:sectPr>
   </w:body>
 </w:document>
+</file>
+
+<file path=word/endnotes.xml><?xml version="1.0" encoding="utf-8"?>
+<w:endnotes xmlns:wpc="http://schemas.microsoft.com/office/word/2010/wordprocessingCanvas" xmlns:cx="http://schemas.microsoft.com/office/drawing/2014/chartex" xmlns:cx1="http://schemas.microsoft.com/office/drawing/2015/9/8/chartex" xmlns:cx2="http://schemas.microsoft.com/office/drawing/2015/10/21/chartex" xmlns:cx3="http://schemas.microsoft.com/office/drawing/2016/5/9/chartex" xmlns:cx4="http://schemas.microsoft.com/office/drawing/2016/5/10/chartex" xmlns:cx5="http://schemas.microsoft.com/office/drawing/2016/5/11/chartex" xmlns:cx6="http://schemas.microsoft.com/office/drawing/2016/5/12/chartex" xmlns:cx7="http://schemas.microsoft.com/office/drawing/2016/5/13/chartex" xmlns:cx8="http://schemas.microsoft.com/office/drawing/2016/5/14/chartex" xmlns:mc="http://schemas.openxmlformats.org/markup-compatibility/2006" xmlns:aink="http://schemas.microsoft.com/office/drawing/2016/ink" xmlns:am3d="http://schemas.microsoft.com/office/drawing/2017/model3d" xmlns:o="urn:schemas-microsoft-com:office:office" xmlns:oel="http://schemas.microsoft.com/office/2019/extlst" xmlns:r="http://schemas.openxmlformats.org/officeDocument/2006/relationships" xmlns:m="http://schemas.openxmlformats.org/officeDocument/2006/math" xmlns:v="urn:schemas-microsoft-com:vml" xmlns:wp14="http://schemas.microsoft.com/office/word/2010/wordprocessingDrawing" xmlns:wp="http://schemas.openxmlformats.org/drawingml/2006/wordprocessingDrawing" xmlns:w10="urn:schemas-microsoft-com:office:word" xmlns:w="http://schemas.openxmlformats.org/wordprocessingml/2006/main" xmlns:w14="http://schemas.microsoft.com/office/word/2010/wordml" xmlns:w15="http://schemas.microsoft.com/office/word/2012/wordml" xmlns:w16cex="http://schemas.microsoft.com/office/word/2018/wordml/cex" xmlns:w16cid="http://schemas.microsoft.com/office/word/2016/wordml/cid" xmlns:w16="http://schemas.microsoft.com/office/word/2018/wordml" xmlns:w16du="http://schemas.microsoft.com/office/word/2023/wordml/word16du" xmlns:w16sdtdh="http://schemas.microsoft.com/office/word/2020/wordml/sdtdatahash" xmlns:w16sdtfl="http://schemas.microsoft.com/office/word/2024/wordml/sdtformatlock" xmlns:w16se="http://schemas.microsoft.com/office/word/2015/wordml/symex" xmlns:wpg="http://schemas.microsoft.com/office/word/2010/wordprocessingGroup" xmlns:wpi="http://schemas.microsoft.com/office/word/2010/wordprocessingInk" xmlns:wne="http://schemas.microsoft.com/office/word/2006/wordml" xmlns:wps="http://schemas.microsoft.com/office/word/2010/wordprocessingShape" mc:Ignorable="w14 w15 w16se w16cid w16 w16cex w16sdtdh w16sdtfl w16du wp14">
+  <w:endnote w:type="separator" w:id="-1">
+    <w:p>
+      <w:pPr>
+        <w:spacing w:after="0" w:line="240" w:lineRule="auto"/>
+      </w:pPr>
+      <w:r>
+        <w:separator/>
+      </w:r>
+    </w:p>
+  </w:endnote>
+  <w:endnote w:type="continuationSeparator" w:id="0">
+    <w:p>
+      <w:pPr>
+        <w:spacing w:after="0" w:line="240" w:lineRule="auto"/>
+      </w:pPr>
+      <w:r>
+        <w:continuationSeparator/>
+      </w:r>
+    </w:p>
+  </w:endnote>
+</w:endnotes>
+</file>
+
+<file path=word/footnotes.xml><?xml version="1.0" encoding="utf-8"?>
+<w:footnotes xmlns:wpc="http://schemas.microsoft.com/office/word/2010/wordprocessingCanvas" xmlns:cx="http://schemas.microsoft.com/office/drawing/2014/chartex" xmlns:cx1="http://schemas.microsoft.com/office/drawing/2015/9/8/chartex" xmlns:cx2="http://schemas.microsoft.com/office/drawing/2015/10/21/chartex" xmlns:cx3="http://schemas.microsoft.com/office/drawing/2016/5/9/chartex" xmlns:cx4="http://schemas.microsoft.com/office/drawing/2016/5/10/chartex" xmlns:cx5="http://schemas.microsoft.com/office/drawing/2016/5/11/chartex" xmlns:cx6="http://schemas.microsoft.com/office/drawing/2016/5/12/chartex" xmlns:cx7="http://schemas.microsoft.com/office/drawing/2016/5/13/chartex" xmlns:cx8="http://schemas.microsoft.com/office/drawing/2016/5/14/chartex" xmlns:mc="http://schemas.openxmlformats.org/markup-compatibility/2006" xmlns:aink="http://schemas.microsoft.com/office/drawing/2016/ink" xmlns:am3d="http://schemas.microsoft.com/office/drawing/2017/model3d" xmlns:o="urn:schemas-microsoft-com:office:office" xmlns:oel="http://schemas.microsoft.com/office/2019/extlst" xmlns:r="http://schemas.openxmlformats.org/officeDocument/2006/relationships" xmlns:m="http://schemas.openxmlformats.org/officeDocument/2006/math" xmlns:v="urn:schemas-microsoft-com:vml" xmlns:wp14="http://schemas.microsoft.com/office/word/2010/wordprocessingDrawing" xmlns:wp="http://schemas.openxmlformats.org/drawingml/2006/wordprocessingDrawing" xmlns:w10="urn:schemas-microsoft-com:office:word" xmlns:w="http://schemas.openxmlformats.org/wordprocessingml/2006/main" xmlns:w14="http://schemas.microsoft.com/office/word/2010/wordml" xmlns:w15="http://schemas.microsoft.com/office/word/2012/wordml" xmlns:w16cex="http://schemas.microsoft.com/office/word/2018/wordml/cex" xmlns:w16cid="http://schemas.microsoft.com/office/word/2016/wordml/cid" xmlns:w16="http://schemas.microsoft.com/office/word/2018/wordml" xmlns:w16du="http://schemas.microsoft.com/office/word/2023/wordml/word16du" xmlns:w16sdtdh="http://schemas.microsoft.com/office/word/2020/wordml/sdtdatahash" xmlns:w16sdtfl="http://schemas.microsoft.com/office/word/2024/wordml/sdtformatlock" xmlns:w16se="http://schemas.microsoft.com/office/word/2015/wordml/symex" xmlns:wpg="http://schemas.microsoft.com/office/word/2010/wordprocessingGroup" xmlns:wpi="http://schemas.microsoft.com/office/word/2010/wordprocessingInk" xmlns:wne="http://schemas.microsoft.com/office/word/2006/wordml" xmlns:wps="http://schemas.microsoft.com/office/word/2010/wordprocessingShape" mc:Ignorable="w14 w15 w16se w16cid w16 w16cex w16sdtdh w16sdtfl w16du wp14">
+  <w:footnote w:type="separator" w:id="-1">
+    <w:p>
+      <w:pPr>
+        <w:spacing w:after="0" w:line="240" w:lineRule="auto"/>
+      </w:pPr>
+      <w:r>
+        <w:separator/>
+      </w:r>
+    </w:p>
+  </w:footnote>
+  <w:footnote w:type="continuationSeparator" w:id="0">
+    <w:p>
+      <w:pPr>
+        <w:spacing w:after="0" w:line="240" w:lineRule="auto"/>
+      </w:pPr>
+      <w:r>
+        <w:continuationSeparator/>
+      </w:r>
+    </w:p>
+  </w:footnote>
+</w:footnotes>
 </file>
 
 <file path=word/numbering.xml><?xml version="1.0" encoding="utf-8"?>
@@ -7590,7 +10425,6 @@
     <w:next w:val="Normal"/>
     <w:link w:val="Heading3Char"/>
     <w:uiPriority w:val="9"/>
-    <w:semiHidden/>
     <w:unhideWhenUsed/>
     <w:qFormat/>
     <w:rsid w:val="00142C6A"/>
@@ -7797,7 +10631,6 @@
     <w:basedOn w:val="DefaultParagraphFont"/>
     <w:link w:val="Heading3"/>
     <w:uiPriority w:val="9"/>
-    <w:semiHidden/>
     <w:rsid w:val="00142C6A"/>
     <w:rPr>
       <w:rFonts w:eastAsiaTheme="majorEastAsia" w:cstheme="majorBidi"/>
@@ -8054,6 +10887,150 @@
       <w:color w:val="2F5496" w:themeColor="accent1" w:themeShade="BF"/>
       <w:spacing w:val="5"/>
     </w:rPr>
+  </w:style>
+  <w:style w:type="character" w:styleId="Strong">
+    <w:name w:val="Strong"/>
+    <w:basedOn w:val="DefaultParagraphFont"/>
+    <w:uiPriority w:val="22"/>
+    <w:qFormat/>
+    <w:rsid w:val="00AC1A07"/>
+    <w:rPr>
+      <w:b/>
+      <w:bCs/>
+    </w:rPr>
+  </w:style>
+  <w:style w:type="paragraph" w:styleId="NormalWeb">
+    <w:name w:val="Normal (Web)"/>
+    <w:basedOn w:val="Normal"/>
+    <w:uiPriority w:val="99"/>
+    <w:semiHidden/>
+    <w:unhideWhenUsed/>
+    <w:rsid w:val="00AC1A07"/>
+    <w:pPr>
+      <w:spacing w:before="100" w:beforeAutospacing="1" w:after="100" w:afterAutospacing="1" w:line="240" w:lineRule="auto"/>
+    </w:pPr>
+    <w:rPr>
+      <w:rFonts w:ascii="Times New Roman" w:eastAsia="Times New Roman" w:hAnsi="Times New Roman" w:cs="Times New Roman"/>
+      <w:kern w:val="0"/>
+      <w:lang w:eastAsia="en-IN"/>
+      <w14:ligatures w14:val="none"/>
+    </w:rPr>
+  </w:style>
+  <w:style w:type="paragraph" w:styleId="HTMLPreformatted">
+    <w:name w:val="HTML Preformatted"/>
+    <w:basedOn w:val="Normal"/>
+    <w:link w:val="HTMLPreformattedChar"/>
+    <w:uiPriority w:val="99"/>
+    <w:semiHidden/>
+    <w:unhideWhenUsed/>
+    <w:rsid w:val="00AC1A07"/>
+    <w:pPr>
+      <w:tabs>
+        <w:tab w:val="left" w:pos="916"/>
+        <w:tab w:val="left" w:pos="1832"/>
+        <w:tab w:val="left" w:pos="2748"/>
+        <w:tab w:val="left" w:pos="3664"/>
+        <w:tab w:val="left" w:pos="4580"/>
+        <w:tab w:val="left" w:pos="5496"/>
+        <w:tab w:val="left" w:pos="6412"/>
+        <w:tab w:val="left" w:pos="7328"/>
+        <w:tab w:val="left" w:pos="8244"/>
+        <w:tab w:val="left" w:pos="9160"/>
+        <w:tab w:val="left" w:pos="10076"/>
+        <w:tab w:val="left" w:pos="10992"/>
+        <w:tab w:val="left" w:pos="11908"/>
+        <w:tab w:val="left" w:pos="12824"/>
+        <w:tab w:val="left" w:pos="13740"/>
+        <w:tab w:val="left" w:pos="14656"/>
+      </w:tabs>
+      <w:spacing w:after="0" w:line="240" w:lineRule="auto"/>
+    </w:pPr>
+    <w:rPr>
+      <w:rFonts w:ascii="Courier New" w:eastAsia="Times New Roman" w:hAnsi="Courier New" w:cs="Courier New"/>
+      <w:kern w:val="0"/>
+      <w:sz w:val="20"/>
+      <w:szCs w:val="20"/>
+      <w:lang w:eastAsia="en-IN"/>
+      <w14:ligatures w14:val="none"/>
+    </w:rPr>
+  </w:style>
+  <w:style w:type="character" w:customStyle="1" w:styleId="HTMLPreformattedChar">
+    <w:name w:val="HTML Preformatted Char"/>
+    <w:basedOn w:val="DefaultParagraphFont"/>
+    <w:link w:val="HTMLPreformatted"/>
+    <w:uiPriority w:val="99"/>
+    <w:semiHidden/>
+    <w:rsid w:val="00AC1A07"/>
+    <w:rPr>
+      <w:rFonts w:ascii="Courier New" w:eastAsia="Times New Roman" w:hAnsi="Courier New" w:cs="Courier New"/>
+      <w:kern w:val="0"/>
+      <w:sz w:val="20"/>
+      <w:szCs w:val="20"/>
+      <w:lang w:eastAsia="en-IN"/>
+      <w14:ligatures w14:val="none"/>
+    </w:rPr>
+  </w:style>
+  <w:style w:type="character" w:styleId="HTMLCode">
+    <w:name w:val="HTML Code"/>
+    <w:basedOn w:val="DefaultParagraphFont"/>
+    <w:uiPriority w:val="99"/>
+    <w:semiHidden/>
+    <w:unhideWhenUsed/>
+    <w:rsid w:val="00AC1A07"/>
+    <w:rPr>
+      <w:rFonts w:ascii="Courier New" w:eastAsia="Times New Roman" w:hAnsi="Courier New" w:cs="Courier New"/>
+      <w:sz w:val="20"/>
+      <w:szCs w:val="20"/>
+    </w:rPr>
+  </w:style>
+  <w:style w:type="character" w:customStyle="1" w:styleId="hljs-selector-class">
+    <w:name w:val="hljs-selector-class"/>
+    <w:basedOn w:val="DefaultParagraphFont"/>
+    <w:rsid w:val="00AC1A07"/>
+  </w:style>
+  <w:style w:type="paragraph" w:styleId="Header">
+    <w:name w:val="header"/>
+    <w:basedOn w:val="Normal"/>
+    <w:link w:val="HeaderChar"/>
+    <w:uiPriority w:val="99"/>
+    <w:unhideWhenUsed/>
+    <w:rsid w:val="00AC1A07"/>
+    <w:pPr>
+      <w:tabs>
+        <w:tab w:val="center" w:pos="4513"/>
+        <w:tab w:val="right" w:pos="9026"/>
+      </w:tabs>
+      <w:spacing w:after="0" w:line="240" w:lineRule="auto"/>
+    </w:pPr>
+  </w:style>
+  <w:style w:type="character" w:customStyle="1" w:styleId="HeaderChar">
+    <w:name w:val="Header Char"/>
+    <w:basedOn w:val="DefaultParagraphFont"/>
+    <w:link w:val="Header"/>
+    <w:uiPriority w:val="99"/>
+    <w:rsid w:val="00AC1A07"/>
+  </w:style>
+  <w:style w:type="paragraph" w:styleId="Footer">
+    <w:name w:val="footer"/>
+    <w:basedOn w:val="Normal"/>
+    <w:link w:val="FooterChar"/>
+    <w:uiPriority w:val="99"/>
+    <w:unhideWhenUsed/>
+    <w:rsid w:val="00AC1A07"/>
+    <w:pPr>
+      <w:tabs>
+        <w:tab w:val="center" w:pos="4513"/>
+        <w:tab w:val="right" w:pos="9026"/>
+      </w:tabs>
+      <w:spacing w:after="0" w:line="240" w:lineRule="auto"/>
+    </w:pPr>
+  </w:style>
+  <w:style w:type="character" w:customStyle="1" w:styleId="FooterChar">
+    <w:name w:val="Footer Char"/>
+    <w:basedOn w:val="DefaultParagraphFont"/>
+    <w:link w:val="Footer"/>
+    <w:uiPriority w:val="99"/>
+    <w:rsid w:val="00AC1A07"/>
   </w:style>
 </w:styles>
 </file>

</xml_diff>